<commit_message>
add 2 more use-cases
</commit_message>
<xml_diff>
--- a/documentation/src/use-cases-v0.1.docx
+++ b/documentation/src/use-cases-v0.1.docx
@@ -513,9 +513,31 @@
           <w:color w:val="5983B0"/>
           <w:sz w:val="32"/>
           <w:u w:val="none"/>
+          <w:lang w:val="en-US"/>
+        </w:rPr>
+        <w:t>use-cases</w:t>
+      </w:r>
+      <w:r>
+        <w:rPr>
+          <w:b/>
+          <w:bCs/>
+          <w:color w:val="5983B0"/>
+          <w:sz w:val="32"/>
+          <w:u w:val="none"/>
           <w:lang w:val="el-GR"/>
         </w:rPr>
         <w:t>-v0.</w:t>
+      </w:r>
+      <w:r>
+        <w:rPr>
+          <w:b/>
+          <w:bCs/>
+          <w:color w:val="5983B0"/>
+          <w:sz w:val="32"/>
+          <w:u w:val="none"/>
+          <w:lang w:val="en-US"/>
+        </w:rPr>
+        <w:t>1</w:t>
       </w:r>
       <w:r>
         <w:br w:type="page"/>
@@ -600,7 +622,7 @@
         <w:pStyle w:val="Normal"/>
         <w:numPr>
           <w:ilvl w:val="0"/>
-          <w:numId w:val="3"/>
+          <w:numId w:val="2"/>
         </w:numPr>
         <w:bidi w:val="0"/>
         <w:spacing w:before="0" w:after="57"/>
@@ -632,7 +654,7 @@
         <w:pStyle w:val="Normal"/>
         <w:numPr>
           <w:ilvl w:val="0"/>
-          <w:numId w:val="3"/>
+          <w:numId w:val="2"/>
         </w:numPr>
         <w:bidi w:val="0"/>
         <w:spacing w:before="0" w:after="57"/>
@@ -664,7 +686,7 @@
         <w:pStyle w:val="Normal"/>
         <w:numPr>
           <w:ilvl w:val="0"/>
-          <w:numId w:val="3"/>
+          <w:numId w:val="2"/>
         </w:numPr>
         <w:bidi w:val="0"/>
         <w:spacing w:before="0" w:after="57"/>
@@ -696,7 +718,7 @@
         <w:pStyle w:val="Normal"/>
         <w:numPr>
           <w:ilvl w:val="0"/>
-          <w:numId w:val="3"/>
+          <w:numId w:val="2"/>
         </w:numPr>
         <w:bidi w:val="0"/>
         <w:spacing w:before="0" w:after="57"/>
@@ -728,7 +750,7 @@
         <w:pStyle w:val="Normal"/>
         <w:numPr>
           <w:ilvl w:val="0"/>
-          <w:numId w:val="3"/>
+          <w:numId w:val="2"/>
         </w:numPr>
         <w:bidi w:val="0"/>
         <w:jc w:val="left"/>
@@ -810,7 +832,7 @@
         <w:pStyle w:val="Heading1"/>
         <w:numPr>
           <w:ilvl w:val="0"/>
-          <w:numId w:val="2"/>
+          <w:numId w:val="1"/>
         </w:numPr>
         <w:bidi w:val="0"/>
         <w:spacing w:before="0" w:after="120"/>
@@ -834,7 +856,7 @@
         <w:pStyle w:val="Heading2"/>
         <w:numPr>
           <w:ilvl w:val="1"/>
-          <w:numId w:val="2"/>
+          <w:numId w:val="1"/>
         </w:numPr>
         <w:bidi w:val="0"/>
         <w:ind w:hanging="0" w:left="0"/>
@@ -857,7 +879,7 @@
         <w:pStyle w:val="Heading3"/>
         <w:numPr>
           <w:ilvl w:val="2"/>
-          <w:numId w:val="2"/>
+          <w:numId w:val="1"/>
         </w:numPr>
         <w:bidi w:val="0"/>
         <w:ind w:hanging="0" w:left="0"/>
@@ -898,7 +920,7 @@
         <w:pStyle w:val="BodyText"/>
         <w:numPr>
           <w:ilvl w:val="0"/>
-          <w:numId w:val="4"/>
+          <w:numId w:val="3"/>
         </w:numPr>
         <w:bidi w:val="0"/>
         <w:jc w:val="left"/>
@@ -920,7 +942,7 @@
         <w:pStyle w:val="BodyText"/>
         <w:numPr>
           <w:ilvl w:val="0"/>
-          <w:numId w:val="4"/>
+          <w:numId w:val="3"/>
         </w:numPr>
         <w:bidi w:val="0"/>
         <w:jc w:val="left"/>
@@ -942,7 +964,7 @@
         <w:pStyle w:val="BodyText"/>
         <w:numPr>
           <w:ilvl w:val="0"/>
-          <w:numId w:val="4"/>
+          <w:numId w:val="3"/>
         </w:numPr>
         <w:bidi w:val="0"/>
         <w:jc w:val="left"/>
@@ -976,13 +998,34 @@
         </w:rPr>
         <w:t xml:space="preserve">Για τις πρώτες δύο υπηρεσίες, ο γυμναστής, θα χρειαστεί να επιλέξει μία ή παραπάνω χρονοθυρίδες που να μην καλύπτονται από κάποια άλλη υπηρεσία. </w:t>
       </w:r>
+      <w:r>
+        <w:rPr>
+          <w:sz w:val="24"/>
+          <w:lang w:val="el-GR"/>
+        </w:rPr>
+        <w:t>Μαζί με τα βασικά στοιχεία της υπηρεσίας ο γυμναστής θα πρέπει να δηλώσει και την τιμή της</w:t>
+      </w:r>
+      <w:r>
+        <w:rPr>
+          <w:sz w:val="24"/>
+          <w:lang w:val="el-GR"/>
+        </w:rPr>
+        <w:t xml:space="preserve"> και το μέγιστο αριθμό ατόμων που μπορεί να εξυπηρετήσει</w:t>
+      </w:r>
+      <w:r>
+        <w:rPr>
+          <w:sz w:val="24"/>
+          <w:lang w:val="el-GR"/>
+        </w:rPr>
+        <w:t>.</w:t>
+      </w:r>
     </w:p>
     <w:p>
       <w:pPr>
         <w:pStyle w:val="Heading3"/>
         <w:numPr>
           <w:ilvl w:val="2"/>
-          <w:numId w:val="2"/>
+          <w:numId w:val="1"/>
         </w:numPr>
         <w:bidi w:val="0"/>
         <w:ind w:hanging="0" w:left="0"/>
@@ -1023,7 +1066,7 @@
         <w:pStyle w:val="Heading3"/>
         <w:numPr>
           <w:ilvl w:val="2"/>
-          <w:numId w:val="2"/>
+          <w:numId w:val="1"/>
         </w:numPr>
         <w:bidi w:val="0"/>
         <w:ind w:hanging="0" w:left="0"/>
@@ -1044,7 +1087,7 @@
         <w:pStyle w:val="BodyText"/>
         <w:numPr>
           <w:ilvl w:val="0"/>
-          <w:numId w:val="5"/>
+          <w:numId w:val="4"/>
         </w:numPr>
         <w:bidi w:val="0"/>
         <w:jc w:val="left"/>
@@ -1066,7 +1109,29 @@
         <w:pStyle w:val="BodyText"/>
         <w:numPr>
           <w:ilvl w:val="0"/>
-          <w:numId w:val="5"/>
+          <w:numId w:val="4"/>
+        </w:numPr>
+        <w:bidi w:val="0"/>
+        <w:jc w:val="left"/>
+        <w:rPr>
+          <w:sz w:val="24"/>
+          <w:lang w:val="el-GR"/>
+        </w:rPr>
+      </w:pPr>
+      <w:r>
+        <w:rPr>
+          <w:sz w:val="24"/>
+          <w:lang w:val="el-GR"/>
+        </w:rPr>
+        <w:t>Το σύστημα επιβεβαιώνει πως ο χρήστης έχει ετοιμάσει τα τραπεζικά του στοιχεία.</w:t>
+      </w:r>
+    </w:p>
+    <w:p>
+      <w:pPr>
+        <w:pStyle w:val="BodyText"/>
+        <w:numPr>
+          <w:ilvl w:val="0"/>
+          <w:numId w:val="4"/>
         </w:numPr>
         <w:bidi w:val="0"/>
         <w:jc w:val="left"/>
@@ -1095,7 +1160,7 @@
         <w:pStyle w:val="BodyText"/>
         <w:numPr>
           <w:ilvl w:val="0"/>
-          <w:numId w:val="5"/>
+          <w:numId w:val="4"/>
         </w:numPr>
         <w:bidi w:val="0"/>
         <w:jc w:val="left"/>
@@ -1117,7 +1182,7 @@
         <w:pStyle w:val="BodyText"/>
         <w:numPr>
           <w:ilvl w:val="0"/>
-          <w:numId w:val="5"/>
+          <w:numId w:val="4"/>
         </w:numPr>
         <w:bidi w:val="0"/>
         <w:jc w:val="left"/>
@@ -1139,7 +1204,7 @@
         <w:pStyle w:val="BodyText"/>
         <w:numPr>
           <w:ilvl w:val="0"/>
-          <w:numId w:val="5"/>
+          <w:numId w:val="4"/>
         </w:numPr>
         <w:bidi w:val="0"/>
         <w:jc w:val="left"/>
@@ -1161,7 +1226,7 @@
         <w:pStyle w:val="BodyText"/>
         <w:numPr>
           <w:ilvl w:val="0"/>
-          <w:numId w:val="5"/>
+          <w:numId w:val="4"/>
         </w:numPr>
         <w:bidi w:val="0"/>
         <w:jc w:val="left"/>
@@ -1203,8 +1268,11 @@
       <w:pPr>
         <w:pStyle w:val="BodyText"/>
         <w:bidi w:val="0"/>
-        <w:jc w:val="left"/>
-        <w:rPr/>
+        <w:spacing w:before="0" w:after="140"/>
+        <w:jc w:val="left"/>
+        <w:rPr>
+          <w:lang w:val="el-GR"/>
+        </w:rPr>
       </w:pPr>
       <w:r>
         <w:rPr>
@@ -1213,93 +1281,8 @@
           <w:sz w:val="28"/>
           <w:lang w:val="el-GR"/>
         </w:rPr>
-        <w:t>Εναλλακτική Ροή 1</w:t>
-      </w:r>
-    </w:p>
-    <w:p>
-      <w:pPr>
-        <w:pStyle w:val="BodyText"/>
-        <w:numPr>
-          <w:ilvl w:val="0"/>
-          <w:numId w:val="6"/>
-        </w:numPr>
-        <w:bidi w:val="0"/>
-        <w:jc w:val="left"/>
-        <w:rPr>
-          <w:b w:val="false"/>
-          <w:bCs w:val="false"/>
-          <w:sz w:val="24"/>
-          <w:lang w:val="el-GR"/>
-        </w:rPr>
-      </w:pPr>
-      <w:r>
-        <w:rPr>
-          <w:b w:val="false"/>
-          <w:bCs w:val="false"/>
-          <w:sz w:val="24"/>
-          <w:lang w:val="el-GR"/>
-        </w:rPr>
-        <w:t>Το σύστημα δεν βρίσκει ελεύθερη χρονοθυρίδα.</w:t>
-      </w:r>
-    </w:p>
-    <w:p>
-      <w:pPr>
-        <w:pStyle w:val="BodyText"/>
-        <w:numPr>
-          <w:ilvl w:val="0"/>
-          <w:numId w:val="6"/>
-        </w:numPr>
-        <w:bidi w:val="0"/>
-        <w:jc w:val="left"/>
-        <w:rPr>
-          <w:sz w:val="24"/>
-          <w:lang w:val="el-GR"/>
-        </w:rPr>
-      </w:pPr>
-      <w:r>
-        <w:rPr>
-          <w:b w:val="false"/>
-          <w:bCs w:val="false"/>
-          <w:sz w:val="24"/>
-          <w:lang w:val="el-GR"/>
-        </w:rPr>
-        <w:t>Το σύστημα εμφανίζει το παράθυρο ”Προσθήκη Υπηρεσίας” μόνο με την επιλογή δημιουργίας εξατομικευμένου προπονητικού προγράμματος.</w:t>
-      </w:r>
-    </w:p>
-    <w:p>
-      <w:pPr>
-        <w:pStyle w:val="BodyText"/>
-        <w:numPr>
-          <w:ilvl w:val="0"/>
-          <w:numId w:val="6"/>
-        </w:numPr>
-        <w:bidi w:val="0"/>
-        <w:jc w:val="left"/>
-        <w:rPr/>
-      </w:pPr>
-      <w:r>
-        <w:rPr>
-          <w:b w:val="false"/>
-          <w:bCs w:val="false"/>
-          <w:sz w:val="24"/>
-          <w:lang w:val="el-GR"/>
-        </w:rPr>
-        <w:t>Η περίπτωση χρήσης συνεχίζει από το βήμα 4 της βασικής ροής.</w:t>
-      </w:r>
-      <w:r>
-        <w:br w:type="page"/>
-      </w:r>
-    </w:p>
-    <w:p>
-      <w:pPr>
-        <w:pStyle w:val="BodyText"/>
-        <w:bidi w:val="0"/>
-        <w:spacing w:before="0" w:after="140"/>
-        <w:jc w:val="left"/>
-        <w:rPr>
-          <w:lang w:val="el-GR"/>
-        </w:rPr>
-      </w:pPr>
+        <w:t xml:space="preserve">Εναλλακτική Ροή </w:t>
+      </w:r>
       <w:r>
         <w:rPr>
           <w:b/>
@@ -1307,14 +1290,85 @@
           <w:sz w:val="28"/>
           <w:lang w:val="el-GR"/>
         </w:rPr>
-        <w:t xml:space="preserve">Εναλλακτική Ροή </w:t>
-      </w:r>
+        <w:t>1</w:t>
+      </w:r>
+    </w:p>
+    <w:p>
+      <w:pPr>
+        <w:pStyle w:val="BodyText"/>
+        <w:numPr>
+          <w:ilvl w:val="0"/>
+          <w:numId w:val="7"/>
+        </w:numPr>
+        <w:bidi w:val="0"/>
+        <w:spacing w:before="0" w:after="140"/>
+        <w:jc w:val="left"/>
+        <w:rPr>
+          <w:b w:val="false"/>
+          <w:bCs w:val="false"/>
+          <w:sz w:val="24"/>
+          <w:szCs w:val="24"/>
+        </w:rPr>
+      </w:pPr>
+      <w:r>
+        <w:rPr>
+          <w:b w:val="false"/>
+          <w:bCs w:val="false"/>
+          <w:sz w:val="24"/>
+          <w:szCs w:val="24"/>
+        </w:rPr>
+        <w:t>Το σύστημα δεν βρίσκει τα τραπεζικά στοιχεία του χρήστη.</w:t>
+      </w:r>
+    </w:p>
+    <w:p>
+      <w:pPr>
+        <w:pStyle w:val="BodyText"/>
+        <w:numPr>
+          <w:ilvl w:val="0"/>
+          <w:numId w:val="7"/>
+        </w:numPr>
+        <w:bidi w:val="0"/>
+        <w:spacing w:before="0" w:after="140"/>
+        <w:jc w:val="left"/>
+        <w:rPr>
+          <w:b w:val="false"/>
+          <w:bCs w:val="false"/>
+          <w:sz w:val="24"/>
+          <w:szCs w:val="24"/>
+        </w:rPr>
+      </w:pPr>
+      <w:r>
+        <w:rPr>
+          <w:b w:val="false"/>
+          <w:bCs w:val="false"/>
+          <w:sz w:val="24"/>
+          <w:szCs w:val="24"/>
+        </w:rPr>
+        <w:t>Το σύστημα εμφανίζει κατάλληλο μήνυμα και επιστρέφει στην σελίδα προφίλ του χρήστη.</w:t>
+      </w:r>
+    </w:p>
+    <w:p>
+      <w:pPr>
+        <w:pStyle w:val="BodyText"/>
+        <w:bidi w:val="0"/>
+        <w:jc w:val="left"/>
+        <w:rPr/>
+      </w:pPr>
       <w:r>
         <w:rPr>
           <w:b/>
           <w:bCs/>
           <w:sz w:val="28"/>
-          <w:lang w:val="en-US"/>
+          <w:lang w:val="el-GR"/>
+        </w:rPr>
+        <w:t xml:space="preserve">Εναλλακτική Ροή </w:t>
+      </w:r>
+      <w:r>
+        <w:rPr>
+          <w:b/>
+          <w:bCs/>
+          <w:sz w:val="28"/>
+          <w:lang w:val="el-GR"/>
         </w:rPr>
         <w:t>2</w:t>
       </w:r>
@@ -1324,7 +1378,7 @@
         <w:pStyle w:val="BodyText"/>
         <w:numPr>
           <w:ilvl w:val="0"/>
-          <w:numId w:val="7"/>
+          <w:numId w:val="5"/>
         </w:numPr>
         <w:bidi w:val="0"/>
         <w:jc w:val="left"/>
@@ -1342,7 +1396,7 @@
           <w:sz w:val="24"/>
           <w:lang w:val="el-GR"/>
         </w:rPr>
-        <w:t>Το σύστημα βρίσκει υπηρεσία του χρήστη με το ίδιο όνομα</w:t>
+        <w:t>Το σύστημα δεν βρίσκει ελεύθερη χρονοθυρίδα.</w:t>
       </w:r>
     </w:p>
     <w:p>
@@ -1350,7 +1404,7 @@
         <w:pStyle w:val="BodyText"/>
         <w:numPr>
           <w:ilvl w:val="0"/>
-          <w:numId w:val="7"/>
+          <w:numId w:val="5"/>
         </w:numPr>
         <w:bidi w:val="0"/>
         <w:jc w:val="left"/>
@@ -1366,7 +1420,7 @@
           <w:sz w:val="24"/>
           <w:lang w:val="el-GR"/>
         </w:rPr>
-        <w:t>Το σύστημα εμφανίζει κατάλληλο μήνυμα</w:t>
+        <w:t>Το σύστημα εμφανίζει το παράθυρο ”Προσθήκη Υπηρεσίας” μόνο με την επιλογή δημιουργίας εξατομικευμένου προπονητικού προγράμματος.</w:t>
       </w:r>
     </w:p>
     <w:p>
@@ -1374,7 +1428,7 @@
         <w:pStyle w:val="BodyText"/>
         <w:numPr>
           <w:ilvl w:val="0"/>
-          <w:numId w:val="7"/>
+          <w:numId w:val="5"/>
         </w:numPr>
         <w:bidi w:val="0"/>
         <w:jc w:val="left"/>
@@ -1387,6 +1441,106 @@
           <w:sz w:val="24"/>
           <w:lang w:val="el-GR"/>
         </w:rPr>
+        <w:t>Η περίπτωση χρήσης συνεχίζει από το βήμα 4 της βασικής ροής.</w:t>
+      </w:r>
+    </w:p>
+    <w:p>
+      <w:pPr>
+        <w:pStyle w:val="BodyText"/>
+        <w:bidi w:val="0"/>
+        <w:spacing w:before="0" w:after="140"/>
+        <w:jc w:val="left"/>
+        <w:rPr>
+          <w:lang w:val="el-GR"/>
+        </w:rPr>
+      </w:pPr>
+      <w:r>
+        <w:rPr>
+          <w:b/>
+          <w:bCs/>
+          <w:sz w:val="28"/>
+          <w:lang w:val="el-GR"/>
+        </w:rPr>
+        <w:t xml:space="preserve">Εναλλακτική Ροή </w:t>
+      </w:r>
+      <w:r>
+        <w:rPr>
+          <w:b/>
+          <w:bCs/>
+          <w:sz w:val="28"/>
+          <w:lang w:val="el-GR"/>
+        </w:rPr>
+        <w:t>3</w:t>
+      </w:r>
+    </w:p>
+    <w:p>
+      <w:pPr>
+        <w:pStyle w:val="BodyText"/>
+        <w:numPr>
+          <w:ilvl w:val="0"/>
+          <w:numId w:val="6"/>
+        </w:numPr>
+        <w:bidi w:val="0"/>
+        <w:jc w:val="left"/>
+        <w:rPr>
+          <w:b w:val="false"/>
+          <w:bCs w:val="false"/>
+          <w:sz w:val="24"/>
+          <w:lang w:val="el-GR"/>
+        </w:rPr>
+      </w:pPr>
+      <w:r>
+        <w:rPr>
+          <w:b w:val="false"/>
+          <w:bCs w:val="false"/>
+          <w:sz w:val="24"/>
+          <w:lang w:val="el-GR"/>
+        </w:rPr>
+        <w:t>Το σύστημα βρίσκει υπηρεσία του χρήστη με το ίδιο όνομα</w:t>
+      </w:r>
+    </w:p>
+    <w:p>
+      <w:pPr>
+        <w:pStyle w:val="BodyText"/>
+        <w:numPr>
+          <w:ilvl w:val="0"/>
+          <w:numId w:val="6"/>
+        </w:numPr>
+        <w:bidi w:val="0"/>
+        <w:jc w:val="left"/>
+        <w:rPr>
+          <w:sz w:val="24"/>
+          <w:lang w:val="el-GR"/>
+        </w:rPr>
+      </w:pPr>
+      <w:r>
+        <w:rPr>
+          <w:b w:val="false"/>
+          <w:bCs w:val="false"/>
+          <w:sz w:val="24"/>
+          <w:lang w:val="el-GR"/>
+        </w:rPr>
+        <w:t>Το σύστημα εμφανίζει κατάλληλο μήνυμα</w:t>
+      </w:r>
+    </w:p>
+    <w:p>
+      <w:pPr>
+        <w:pStyle w:val="BodyText"/>
+        <w:numPr>
+          <w:ilvl w:val="0"/>
+          <w:numId w:val="6"/>
+        </w:numPr>
+        <w:bidi w:val="0"/>
+        <w:jc w:val="left"/>
+        <w:rPr/>
+      </w:pPr>
+      <w:r>
+        <w:rPr>
+          <w:b w:val="false"/>
+          <w:bCs w:val="false"/>
+          <w:sz w:val="24"/>
+          <w:lang w:val="el-GR"/>
+        </w:rPr>
         <w:t>Η περίπτωση χρήσης συνεχίζει από το βήμα 4 της βασικής ροής χωρίς να σβήσει τα στοιχεία που είχε ήδη γράψει ο χρήστης.</w:t>
       </w:r>
     </w:p>
@@ -1395,7 +1549,7 @@
         <w:pStyle w:val="Heading3"/>
         <w:numPr>
           <w:ilvl w:val="2"/>
-          <w:numId w:val="2"/>
+          <w:numId w:val="1"/>
         </w:numPr>
         <w:bidi w:val="0"/>
         <w:ind w:hanging="0" w:left="0"/>
@@ -1423,6 +1577,17 @@
     </w:p>
     <w:p>
       <w:pPr>
+        <w:pStyle w:val="BodyText"/>
+        <w:bidi w:val="0"/>
+        <w:jc w:val="left"/>
+        <w:rPr/>
+      </w:pPr>
+      <w:r>
+        <w:rPr/>
+      </w:r>
+    </w:p>
+    <w:p>
+      <w:pPr>
         <w:pStyle w:val="Heading2"/>
         <w:numPr>
           <w:ilvl w:val="0"/>
@@ -1437,13 +1602,17 @@
         <w:rPr/>
         <w:t>1.2 Καταχώρηση Αξιολόγησης</w:t>
       </w:r>
+      <w:r>
+        <w:rPr/>
+        <w:commentReference w:id="0"/>
+      </w:r>
     </w:p>
     <w:p>
       <w:pPr>
         <w:pStyle w:val="Heading3"/>
         <w:numPr>
           <w:ilvl w:val="2"/>
-          <w:numId w:val="2"/>
+          <w:numId w:val="1"/>
         </w:numPr>
         <w:bidi w:val="0"/>
         <w:ind w:hanging="0" w:left="0"/>
@@ -1457,10 +1626,27 @@
     </w:p>
     <w:p>
       <w:pPr>
+        <w:pStyle w:val="BodyText"/>
+        <w:bidi w:val="0"/>
+        <w:ind w:hanging="0" w:left="0"/>
+        <w:jc w:val="left"/>
+        <w:rPr/>
+      </w:pPr>
+      <w:r>
+        <w:rPr/>
+        <w:t>Ο χρήστης έχει την επιλογή να καταχωρήσει αξιολόγηση για κάποια υπηρεσία στην οποία είναι εγγεγραμμένος για κάποιο καιρό. Η αξιολόγηση αποτελείται από ένα μικρό κείμενο και μία βαθμολόγηση από το 1 έως το 5, με βήμα 0.5, στην μορφή αστεριών. Η αξιολόγηση μπορεί να είναι προς κάποια υπηρεσία ή τον ίδιο τον γυμναστή.</w:t>
+      </w:r>
+      <w:r>
+        <w:rPr/>
+        <w:t xml:space="preserve"> Ο κάθε χρήστης δικαιούται μια μόνο αξιολόγηση προς κάθε υπηρεσία/γυμναστή.</w:t>
+      </w:r>
+    </w:p>
+    <w:p>
+      <w:pPr>
         <w:pStyle w:val="Heading3"/>
         <w:numPr>
           <w:ilvl w:val="2"/>
-          <w:numId w:val="2"/>
+          <w:numId w:val="1"/>
         </w:numPr>
         <w:bidi w:val="0"/>
         <w:ind w:hanging="0" w:left="0"/>
@@ -1474,19 +1660,361 @@
     </w:p>
     <w:p>
       <w:pPr>
+        <w:pStyle w:val="BodyText"/>
+        <w:bidi w:val="0"/>
+        <w:ind w:hanging="0" w:left="0"/>
+        <w:jc w:val="left"/>
+        <w:rPr/>
+      </w:pPr>
+      <w:r>
+        <w:rPr/>
+        <w:t>Ο χρήστης είναι συνδεδεμένος και βρίσκεται στην σελίδα προβολής της υπηρεσίας.</w:t>
+      </w:r>
+    </w:p>
+    <w:p>
+      <w:pPr>
         <w:pStyle w:val="Heading3"/>
         <w:numPr>
+          <w:ilvl w:val="0"/>
+          <w:numId w:val="0"/>
+        </w:numPr>
+        <w:bidi w:val="0"/>
+        <w:ind w:hanging="0" w:left="0"/>
+        <w:jc w:val="left"/>
+        <w:rPr/>
+      </w:pPr>
+      <w:r>
+        <w:rPr/>
+        <w:t>1.2.3 Βασική Ροή</w:t>
+      </w:r>
+    </w:p>
+    <w:p>
+      <w:pPr>
+        <w:pStyle w:val="BodyText"/>
+        <w:numPr>
+          <w:ilvl w:val="0"/>
+          <w:numId w:val="13"/>
+        </w:numPr>
+        <w:bidi w:val="0"/>
+        <w:jc w:val="left"/>
+        <w:rPr/>
+      </w:pPr>
+      <w:r>
+        <w:rPr/>
+        <w:t>Ο χρήστης πατάει το κουμπί "Προσθήκη Αξιολόγησης" στο κάτω μέρος της οθόνης  προβολής υπηρεσίας</w:t>
+      </w:r>
+      <w:r>
+        <w:rPr/>
+        <w:t>.</w:t>
+      </w:r>
+    </w:p>
+    <w:p>
+      <w:pPr>
+        <w:pStyle w:val="BodyText"/>
+        <w:numPr>
+          <w:ilvl w:val="0"/>
+          <w:numId w:val="13"/>
+        </w:numPr>
+        <w:bidi w:val="0"/>
+        <w:jc w:val="left"/>
+        <w:rPr/>
+      </w:pPr>
+      <w:r>
+        <w:rPr/>
+        <w:t>Το σύστημα επιβεβαιώνει πως ο χρήστης είναι εγγεγραμμένος στην υπηρεσία για τουλάχιστον έναν μήνα.</w:t>
+      </w:r>
+    </w:p>
+    <w:p>
+      <w:pPr>
+        <w:pStyle w:val="BodyText"/>
+        <w:numPr>
+          <w:ilvl w:val="0"/>
+          <w:numId w:val="13"/>
+        </w:numPr>
+        <w:bidi w:val="0"/>
+        <w:jc w:val="left"/>
+        <w:rPr/>
+      </w:pPr>
+      <w:r>
+        <w:rPr/>
+        <w:t xml:space="preserve">Το σύστημα εμφανίζει παράθυρο που περιέχει </w:t>
+      </w:r>
+      <w:r>
+        <w:rPr/>
+        <w:t>επιλογή βαθμολόγησης 1 έως 5, κειμενογράφο και επιλογή "Αξιολόγηση Υπηρεσίας" ή "Αξιολόγηση Γυμναστή".</w:t>
+      </w:r>
+    </w:p>
+    <w:p>
+      <w:pPr>
+        <w:pStyle w:val="BodyText"/>
+        <w:numPr>
+          <w:ilvl w:val="0"/>
+          <w:numId w:val="13"/>
+        </w:numPr>
+        <w:bidi w:val="0"/>
+        <w:jc w:val="left"/>
+        <w:rPr/>
+      </w:pPr>
+      <w:r>
+        <w:rPr/>
+        <w:t>Ο χρήστης πατάει το κουμπί "Προσθήκη".</w:t>
+      </w:r>
+    </w:p>
+    <w:p>
+      <w:pPr>
+        <w:pStyle w:val="BodyText"/>
+        <w:numPr>
+          <w:ilvl w:val="0"/>
+          <w:numId w:val="13"/>
+        </w:numPr>
+        <w:bidi w:val="0"/>
+        <w:jc w:val="left"/>
+        <w:rPr/>
+      </w:pPr>
+      <w:r>
+        <w:rPr/>
+        <w:t xml:space="preserve">Το σύστημα εμφανίζει κατάλληλο μήνυμα </w:t>
+      </w:r>
+      <w:r>
+        <w:rPr/>
+        <w:t>και επιστρέφει τον χρήστη στην σελίδα προβολής υπηρεσίας</w:t>
+      </w:r>
+      <w:r>
+        <w:rPr/>
+        <w:t>.</w:t>
+      </w:r>
+    </w:p>
+    <w:p>
+      <w:pPr>
+        <w:pStyle w:val="Heading3"/>
+        <w:numPr>
+          <w:ilvl w:val="0"/>
+          <w:numId w:val="0"/>
+        </w:numPr>
+        <w:bidi w:val="0"/>
+        <w:ind w:hanging="0" w:left="0"/>
+        <w:jc w:val="left"/>
+        <w:rPr/>
+      </w:pPr>
+      <w:r>
+        <w:rPr/>
+        <w:t>1.2.4 Εναλλακτικές Ροές</w:t>
+      </w:r>
+    </w:p>
+    <w:p>
+      <w:pPr>
+        <w:pStyle w:val="BodyText"/>
+        <w:bidi w:val="0"/>
+        <w:spacing w:before="0" w:after="140"/>
+        <w:jc w:val="left"/>
+        <w:rPr>
+          <w:lang w:val="el-GR"/>
+        </w:rPr>
+      </w:pPr>
+      <w:r>
+        <w:rPr>
+          <w:b/>
+          <w:bCs/>
+          <w:sz w:val="28"/>
+          <w:lang w:val="el-GR"/>
+        </w:rPr>
+        <w:t xml:space="preserve">Εναλλακτική Ροή </w:t>
+      </w:r>
+      <w:r>
+        <w:rPr>
+          <w:b/>
+          <w:bCs/>
+          <w:sz w:val="28"/>
+          <w:lang w:val="el-GR"/>
+        </w:rPr>
+        <w:t>1</w:t>
+      </w:r>
+    </w:p>
+    <w:p>
+      <w:pPr>
+        <w:pStyle w:val="BodyText"/>
+        <w:numPr>
+          <w:ilvl w:val="0"/>
+          <w:numId w:val="14"/>
+        </w:numPr>
+        <w:bidi w:val="0"/>
+        <w:jc w:val="left"/>
+        <w:rPr/>
+      </w:pPr>
+      <w:r>
+        <w:rPr/>
+        <w:t>Το σύστημα βρίσκει πως ο χρήστης δεν είναι εγγεγραμμένος στην υπηρεσία ή πως δεν είναι εγγεγραμμένος αρκετό καιρό.</w:t>
+      </w:r>
+    </w:p>
+    <w:p>
+      <w:pPr>
+        <w:pStyle w:val="BodyText"/>
+        <w:numPr>
+          <w:ilvl w:val="0"/>
+          <w:numId w:val="14"/>
+        </w:numPr>
+        <w:bidi w:val="0"/>
+        <w:jc w:val="left"/>
+        <w:rPr/>
+      </w:pPr>
+      <w:r>
+        <w:rPr/>
+        <w:t xml:space="preserve">Το σύστημα εμφανίζει κατάλληλο μήνυμα και παραμένει </w:t>
+      </w:r>
+      <w:r>
+        <w:rPr/>
+        <w:t>στην σελίδα προβολής υπηρεσίας</w:t>
+      </w:r>
+      <w:r>
+        <w:rPr/>
+        <w:t>.</w:t>
+      </w:r>
+    </w:p>
+    <w:p>
+      <w:pPr>
+        <w:pStyle w:val="BodyText"/>
+        <w:bidi w:val="0"/>
+        <w:spacing w:before="0" w:after="140"/>
+        <w:jc w:val="left"/>
+        <w:rPr>
+          <w:lang w:val="el-GR"/>
+        </w:rPr>
+      </w:pPr>
+      <w:r>
+        <w:rPr>
+          <w:b/>
+          <w:bCs/>
+          <w:sz w:val="28"/>
+          <w:lang w:val="el-GR"/>
+        </w:rPr>
+        <w:t xml:space="preserve">Εναλλακτική Ροή </w:t>
+      </w:r>
+      <w:r>
+        <w:rPr>
+          <w:b/>
+          <w:bCs/>
+          <w:sz w:val="28"/>
+          <w:lang w:val="el-GR"/>
+        </w:rPr>
+        <w:t>2</w:t>
+      </w:r>
+    </w:p>
+    <w:p>
+      <w:pPr>
+        <w:pStyle w:val="BodyText"/>
+        <w:numPr>
+          <w:ilvl w:val="0"/>
+          <w:numId w:val="15"/>
+        </w:numPr>
+        <w:bidi w:val="0"/>
+        <w:spacing w:before="0" w:after="140"/>
+        <w:jc w:val="left"/>
+        <w:rPr/>
+      </w:pPr>
+      <w:r>
+        <w:rPr/>
+        <w:t>Ο χρήστης δεν συμπλήρωσε βαθμολογία ή κείμενο ή έχει ήδη καταχωρήσει αξιολόγηση για την συγκεκριμένη υπηρεσία/γυμναστή.</w:t>
+      </w:r>
+    </w:p>
+    <w:p>
+      <w:pPr>
+        <w:pStyle w:val="BodyText"/>
+        <w:numPr>
+          <w:ilvl w:val="0"/>
+          <w:numId w:val="15"/>
+        </w:numPr>
+        <w:bidi w:val="0"/>
+        <w:jc w:val="left"/>
+        <w:rPr/>
+      </w:pPr>
+      <w:r>
+        <w:rPr>
+          <w:b w:val="false"/>
+          <w:bCs w:val="false"/>
+          <w:sz w:val="24"/>
+          <w:lang w:val="el-GR"/>
+        </w:rPr>
+        <w:t xml:space="preserve">Η περίπτωση χρήσης συνεχίζει από το βήμα </w:t>
+      </w:r>
+      <w:r>
+        <w:rPr>
+          <w:b w:val="false"/>
+          <w:bCs w:val="false"/>
+          <w:sz w:val="24"/>
+          <w:lang w:val="el-GR"/>
+        </w:rPr>
+        <w:t>5</w:t>
+      </w:r>
+      <w:r>
+        <w:rPr>
+          <w:b w:val="false"/>
+          <w:bCs w:val="false"/>
+          <w:sz w:val="24"/>
+          <w:lang w:val="el-GR"/>
+        </w:rPr>
+        <w:t xml:space="preserve"> της βασικής ροής</w:t>
+      </w:r>
+      <w:r>
+        <w:rPr>
+          <w:b w:val="false"/>
+          <w:bCs w:val="false"/>
+          <w:sz w:val="24"/>
+          <w:lang w:val="el-GR"/>
+        </w:rPr>
+        <w:t xml:space="preserve"> χωρίς να καταχωρήσει την αξιολόγηση.</w:t>
+      </w:r>
+    </w:p>
+    <w:p>
+      <w:pPr>
+        <w:pStyle w:val="Heading3"/>
+        <w:numPr>
           <w:ilvl w:val="2"/>
-          <w:numId w:val="2"/>
-        </w:numPr>
-        <w:bidi w:val="0"/>
-        <w:ind w:hanging="0" w:left="0"/>
-        <w:jc w:val="left"/>
-        <w:rPr/>
-      </w:pPr>
-      <w:r>
-        <w:rPr/>
-        <w:t>1.2.3 Βασική Ροή</w:t>
+          <w:numId w:val="1"/>
+        </w:numPr>
+        <w:bidi w:val="0"/>
+        <w:ind w:hanging="0" w:left="0"/>
+        <w:jc w:val="left"/>
+        <w:rPr/>
+      </w:pPr>
+      <w:r>
+        <w:rPr/>
+        <w:t>1.2.5 Μετά-συνθήκες</w:t>
+      </w:r>
+    </w:p>
+    <w:p>
+      <w:pPr>
+        <w:pStyle w:val="BodyText"/>
+        <w:bidi w:val="0"/>
+        <w:ind w:hanging="0" w:left="0"/>
+        <w:jc w:val="left"/>
+        <w:rPr/>
+      </w:pPr>
+      <w:r>
+        <w:rPr/>
+        <w:t>Η αξιολόγηση του χρήστη αποθηκεύεται στη βάση δεδομένων του συστήματος και εμφανίζεται στην αντίστοιχη σελίδα (προβολής υπηρεσίας ή σελίδα προφίλ γυμναστή).</w:t>
+      </w:r>
+    </w:p>
+    <w:p>
+      <w:pPr>
+        <w:pStyle w:val="Heading2"/>
+        <w:numPr>
+          <w:ilvl w:val="0"/>
+          <w:numId w:val="0"/>
+        </w:numPr>
+        <w:bidi w:val="0"/>
+        <w:ind w:hanging="0" w:left="0"/>
+        <w:jc w:val="left"/>
+        <w:rPr/>
+      </w:pPr>
+      <w:r>
+        <w:rPr/>
+        <w:t xml:space="preserve">1.3 </w:t>
+      </w:r>
+      <w:r>
+        <w:rPr>
+          <w:lang w:val="el-GR"/>
+        </w:rPr>
+        <w:t>Εγγραφή Σε Υπηρεσία</w:t>
       </w:r>
     </w:p>
     <w:p>
@@ -1494,33 +2022,609 @@
         <w:pStyle w:val="Heading3"/>
         <w:numPr>
           <w:ilvl w:val="2"/>
-          <w:numId w:val="2"/>
-        </w:numPr>
-        <w:bidi w:val="0"/>
-        <w:ind w:hanging="0" w:left="0"/>
-        <w:jc w:val="left"/>
-        <w:rPr/>
-      </w:pPr>
-      <w:r>
-        <w:rPr/>
-        <w:t>1.2.4 Εναλλακτικές Ροές</w:t>
+          <w:numId w:val="1"/>
+        </w:numPr>
+        <w:bidi w:val="0"/>
+        <w:ind w:hanging="0" w:left="0"/>
+        <w:jc w:val="left"/>
+        <w:rPr/>
+      </w:pPr>
+      <w:r>
+        <w:rPr/>
+        <w:t>1.3.1 Σύντομη Περιγραφή</w:t>
+      </w:r>
+    </w:p>
+    <w:p>
+      <w:pPr>
+        <w:pStyle w:val="BodyText"/>
+        <w:bidi w:val="0"/>
+        <w:ind w:hanging="0" w:left="0"/>
+        <w:jc w:val="left"/>
+        <w:rPr/>
+      </w:pPr>
+      <w:r>
+        <w:rPr/>
+        <w:t xml:space="preserve">Ο χρήστης μπορεί να εγγραφεί σε μία ή παραπάνω υπηρεσίες </w:t>
+      </w:r>
+      <w:r>
+        <w:rPr/>
+        <w:t>ο</w:t>
+      </w:r>
+      <w:r>
+        <w:rPr/>
+        <w:t xml:space="preserve">ι </w:t>
+      </w:r>
+      <w:r>
+        <w:rPr/>
+        <w:t xml:space="preserve">οποίες </w:t>
+      </w:r>
+      <w:r>
+        <w:rPr/>
+        <w:t xml:space="preserve">δεν </w:t>
+      </w:r>
+      <w:r>
+        <w:rPr/>
+        <w:t>επι</w:t>
+      </w:r>
+      <w:r>
+        <w:rPr/>
+        <w:t>καλύπτονται χρονικά</w:t>
+      </w:r>
+      <w:r>
+        <w:rPr/>
+        <w:t xml:space="preserve"> και μ</w:t>
+      </w:r>
+      <w:r>
+        <w:rPr>
+          <w:lang w:val="el-GR"/>
+        </w:rPr>
+        <w:t xml:space="preserve">πορεί να γράφει σχόλια κατά την εγγραφή που μπορεί να δει ο γυμναστής. </w:t>
       </w:r>
     </w:p>
     <w:p>
       <w:pPr>
         <w:pStyle w:val="Heading3"/>
         <w:numPr>
+          <w:ilvl w:val="0"/>
+          <w:numId w:val="0"/>
+        </w:numPr>
+        <w:bidi w:val="0"/>
+        <w:ind w:hanging="0" w:left="0"/>
+        <w:jc w:val="left"/>
+        <w:rPr/>
+      </w:pPr>
+      <w:r>
+        <w:rPr/>
+        <w:t>1.3.2 Προ-συνθήκες</w:t>
+      </w:r>
+    </w:p>
+    <w:p>
+      <w:pPr>
+        <w:pStyle w:val="BodyText"/>
+        <w:bidi w:val="0"/>
+        <w:ind w:hanging="0" w:left="0"/>
+        <w:jc w:val="left"/>
+        <w:rPr/>
+      </w:pPr>
+      <w:r>
+        <w:rPr/>
+        <w:t>Ο χρήστης είναι συνδεδεμένος</w:t>
+      </w:r>
+      <w:r>
+        <w:rPr/>
+        <w:t xml:space="preserve"> και βρίσκεται στην σελίδα προβολής υπηρεσίας</w:t>
+      </w:r>
+      <w:r>
+        <w:rPr/>
+        <w:t>.</w:t>
+      </w:r>
+    </w:p>
+    <w:p>
+      <w:pPr>
+        <w:pStyle w:val="Heading3"/>
+        <w:numPr>
+          <w:ilvl w:val="0"/>
+          <w:numId w:val="0"/>
+        </w:numPr>
+        <w:bidi w:val="0"/>
+        <w:ind w:hanging="0" w:left="0"/>
+        <w:jc w:val="left"/>
+        <w:rPr/>
+      </w:pPr>
+      <w:r>
+        <w:rPr/>
+        <w:t>1.3.3 Βασική Ροή</w:t>
+      </w:r>
+    </w:p>
+    <w:p>
+      <w:pPr>
+        <w:pStyle w:val="BodyText"/>
+        <w:numPr>
+          <w:ilvl w:val="0"/>
+          <w:numId w:val="8"/>
+        </w:numPr>
+        <w:bidi w:val="0"/>
+        <w:jc w:val="left"/>
+        <w:rPr/>
+      </w:pPr>
+      <w:r>
+        <w:rPr/>
+        <w:t>Ο χρήστης πατάει το κουμπί "Αίτηση Εγγραφής στην Υπηρεσία".</w:t>
+      </w:r>
+    </w:p>
+    <w:p>
+      <w:pPr>
+        <w:pStyle w:val="BodyText"/>
+        <w:numPr>
+          <w:ilvl w:val="0"/>
+          <w:numId w:val="8"/>
+        </w:numPr>
+        <w:bidi w:val="0"/>
+        <w:jc w:val="left"/>
+        <w:rPr/>
+      </w:pPr>
+      <w:r>
+        <w:rPr/>
+        <w:t xml:space="preserve">Το σύστημα επιβεβαιώνει πως δεν υπάρχει χρονική </w:t>
+      </w:r>
+      <w:r>
+        <w:rPr>
+          <w:lang w:val="el-GR"/>
+        </w:rPr>
+        <w:t>επι</w:t>
+      </w:r>
+      <w:r>
+        <w:rPr/>
+        <w:t>κάλυψη με κάποια άλλη υπηρεσία.</w:t>
+      </w:r>
+    </w:p>
+    <w:p>
+      <w:pPr>
+        <w:pStyle w:val="BodyText"/>
+        <w:numPr>
+          <w:ilvl w:val="0"/>
+          <w:numId w:val="8"/>
+        </w:numPr>
+        <w:bidi w:val="0"/>
+        <w:jc w:val="left"/>
+        <w:rPr/>
+      </w:pPr>
+      <w:r>
+        <w:rPr/>
+        <w:t>Το σύστημα εμφανίζει παράθυρο επιβεβαίωσης με κειμενογράφο για προσθήκη σχολίων και επιλογή τρόπου πληρωμής.</w:t>
+      </w:r>
+    </w:p>
+    <w:p>
+      <w:pPr>
+        <w:pStyle w:val="BodyText"/>
+        <w:numPr>
+          <w:ilvl w:val="0"/>
+          <w:numId w:val="8"/>
+        </w:numPr>
+        <w:bidi w:val="0"/>
+        <w:jc w:val="left"/>
+        <w:rPr/>
+      </w:pPr>
+      <w:r>
+        <w:rPr/>
+        <w:t>Ο χρήστης πατάει το κουμπί "Αποστολή Αίτησης".</w:t>
+      </w:r>
+    </w:p>
+    <w:p>
+      <w:pPr>
+        <w:pStyle w:val="BodyText"/>
+        <w:numPr>
+          <w:ilvl w:val="0"/>
+          <w:numId w:val="8"/>
+        </w:numPr>
+        <w:bidi w:val="0"/>
+        <w:jc w:val="left"/>
+        <w:rPr/>
+      </w:pPr>
+      <w:r>
+        <w:rPr/>
+        <w:t>Το σύστημα εμφανίζει κατάλληλο μήνυμα και επιστρέφει τον χρήστη στην σελίδα προβολής υπηρεσίας</w:t>
+      </w:r>
+      <w:r>
+        <w:rPr/>
+        <w:t>.</w:t>
+      </w:r>
+    </w:p>
+    <w:p>
+      <w:pPr>
+        <w:pStyle w:val="Heading3"/>
+        <w:numPr>
+          <w:ilvl w:val="0"/>
+          <w:numId w:val="0"/>
+        </w:numPr>
+        <w:bidi w:val="0"/>
+        <w:ind w:hanging="0" w:left="0"/>
+        <w:jc w:val="left"/>
+        <w:rPr/>
+      </w:pPr>
+      <w:r>
+        <w:rPr/>
+        <w:t>1.3.4 Εναλλακτικές Ροές</w:t>
+      </w:r>
+    </w:p>
+    <w:p>
+      <w:pPr>
+        <w:pStyle w:val="BodyText"/>
+        <w:bidi w:val="0"/>
+        <w:spacing w:before="0" w:after="140"/>
+        <w:jc w:val="left"/>
+        <w:rPr>
+          <w:lang w:val="el-GR"/>
+        </w:rPr>
+      </w:pPr>
+      <w:r>
+        <w:rPr>
+          <w:b/>
+          <w:bCs/>
+          <w:sz w:val="28"/>
+          <w:lang w:val="el-GR"/>
+        </w:rPr>
+        <w:t xml:space="preserve">Εναλλακτική Ροή </w:t>
+      </w:r>
+      <w:r>
+        <w:rPr>
+          <w:b/>
+          <w:bCs/>
+          <w:sz w:val="28"/>
+          <w:lang w:val="el-GR"/>
+        </w:rPr>
+        <w:t>1</w:t>
+      </w:r>
+    </w:p>
+    <w:p>
+      <w:pPr>
+        <w:pStyle w:val="BodyText"/>
+        <w:numPr>
+          <w:ilvl w:val="0"/>
+          <w:numId w:val="9"/>
+        </w:numPr>
+        <w:bidi w:val="0"/>
+        <w:jc w:val="left"/>
+        <w:rPr/>
+      </w:pPr>
+      <w:r>
+        <w:rPr/>
+        <w:t xml:space="preserve">Το σύστημα βρίσκει </w:t>
+      </w:r>
+      <w:r>
+        <w:rPr/>
+        <w:t xml:space="preserve">χρονική </w:t>
+      </w:r>
+      <w:r>
+        <w:rPr>
+          <w:lang w:val="el-GR"/>
+        </w:rPr>
+        <w:t>επι</w:t>
+      </w:r>
+      <w:r>
+        <w:rPr/>
+        <w:t>κάλυψη με κάποια άλλη υπηρεσία.</w:t>
+      </w:r>
+    </w:p>
+    <w:p>
+      <w:pPr>
+        <w:pStyle w:val="BodyText"/>
+        <w:numPr>
+          <w:ilvl w:val="0"/>
+          <w:numId w:val="9"/>
+        </w:numPr>
+        <w:bidi w:val="0"/>
+        <w:jc w:val="left"/>
+        <w:rPr/>
+      </w:pPr>
+      <w:r>
+        <w:rPr>
+          <w:b w:val="false"/>
+          <w:bCs w:val="false"/>
+          <w:sz w:val="24"/>
+          <w:lang w:val="el-GR"/>
+        </w:rPr>
+        <w:t xml:space="preserve">Η περίπτωση χρήσης συνεχίζει από το βήμα </w:t>
+      </w:r>
+      <w:r>
+        <w:rPr>
+          <w:b w:val="false"/>
+          <w:bCs w:val="false"/>
+          <w:sz w:val="24"/>
+          <w:lang w:val="el-GR"/>
+        </w:rPr>
+        <w:t>5</w:t>
+      </w:r>
+      <w:r>
+        <w:rPr>
+          <w:b w:val="false"/>
+          <w:bCs w:val="false"/>
+          <w:sz w:val="24"/>
+          <w:lang w:val="el-GR"/>
+        </w:rPr>
+        <w:t xml:space="preserve"> της βασικής ροής</w:t>
+      </w:r>
+      <w:r>
+        <w:rPr>
+          <w:b w:val="false"/>
+          <w:bCs w:val="false"/>
+          <w:sz w:val="24"/>
+          <w:lang w:val="el-GR"/>
+        </w:rPr>
+        <w:t>.</w:t>
+      </w:r>
+    </w:p>
+    <w:p>
+      <w:pPr>
+        <w:pStyle w:val="BodyText"/>
+        <w:bidi w:val="0"/>
+        <w:spacing w:before="0" w:after="140"/>
+        <w:jc w:val="left"/>
+        <w:rPr>
+          <w:lang w:val="el-GR"/>
+        </w:rPr>
+      </w:pPr>
+      <w:r>
+        <w:rPr>
+          <w:b/>
+          <w:bCs/>
+          <w:sz w:val="28"/>
+          <w:lang w:val="el-GR"/>
+        </w:rPr>
+        <w:t>Εναλλακτική Ροή 2</w:t>
+      </w:r>
+    </w:p>
+    <w:p>
+      <w:pPr>
+        <w:pStyle w:val="BodyText"/>
+        <w:numPr>
+          <w:ilvl w:val="0"/>
+          <w:numId w:val="12"/>
+        </w:numPr>
+        <w:bidi w:val="0"/>
+        <w:spacing w:before="0" w:after="140"/>
+        <w:jc w:val="left"/>
+        <w:rPr/>
+      </w:pPr>
+      <w:r>
+        <w:rPr/>
+        <w:t xml:space="preserve">Ο χρήστης </w:t>
+      </w:r>
+      <w:r>
+        <w:rPr>
+          <w:u w:val="single"/>
+        </w:rPr>
+        <w:t>δεν</w:t>
+      </w:r>
+      <w:r>
+        <w:rPr>
+          <w:u w:val="none"/>
+        </w:rPr>
+        <w:t xml:space="preserve"> επέλεξε τρόπο πληρωμής.</w:t>
+      </w:r>
+    </w:p>
+    <w:p>
+      <w:pPr>
+        <w:pStyle w:val="BodyText"/>
+        <w:numPr>
+          <w:ilvl w:val="0"/>
+          <w:numId w:val="12"/>
+        </w:numPr>
+        <w:bidi w:val="0"/>
+        <w:spacing w:before="0" w:after="140"/>
+        <w:jc w:val="left"/>
+        <w:rPr/>
+      </w:pPr>
+      <w:r>
+        <w:rPr>
+          <w:u w:val="none"/>
+        </w:rPr>
+        <w:t>Τ</w:t>
+      </w:r>
+      <w:r>
+        <w:rPr>
+          <w:u w:val="none"/>
+        </w:rPr>
+        <w:t xml:space="preserve">ο σύστημα εμφανίζει κατάλληλο μήνυμα και η </w:t>
+      </w:r>
+      <w:r>
+        <w:rPr>
+          <w:b w:val="false"/>
+          <w:bCs w:val="false"/>
+          <w:sz w:val="24"/>
+          <w:u w:val="none"/>
+          <w:lang w:val="el-GR"/>
+        </w:rPr>
+        <w:t>περίπτωση χρήσης συνεχίζει από το βήμα 3 της βασικής ροής.</w:t>
+      </w:r>
+    </w:p>
+    <w:p>
+      <w:pPr>
+        <w:pStyle w:val="BodyText"/>
+        <w:bidi w:val="0"/>
+        <w:spacing w:before="0" w:after="140"/>
+        <w:jc w:val="left"/>
+        <w:rPr>
+          <w:lang w:val="el-GR"/>
+        </w:rPr>
+      </w:pPr>
+      <w:r>
+        <w:rPr>
+          <w:b/>
+          <w:bCs/>
+          <w:sz w:val="28"/>
+          <w:lang w:val="el-GR"/>
+        </w:rPr>
+        <w:t xml:space="preserve">Εναλλακτική Ροή </w:t>
+      </w:r>
+      <w:r>
+        <w:rPr>
+          <w:b/>
+          <w:bCs/>
+          <w:sz w:val="28"/>
+          <w:lang w:val="el-GR"/>
+        </w:rPr>
+        <w:t>3</w:t>
+      </w:r>
+    </w:p>
+    <w:p>
+      <w:pPr>
+        <w:pStyle w:val="BodyText"/>
+        <w:numPr>
+          <w:ilvl w:val="0"/>
+          <w:numId w:val="10"/>
+        </w:numPr>
+        <w:bidi w:val="0"/>
+        <w:spacing w:before="0" w:after="140"/>
+        <w:jc w:val="left"/>
+        <w:rPr/>
+      </w:pPr>
+      <w:r>
+        <w:rPr/>
+        <w:t>Ο χρήστης επέλεξε ηλεκτρονική πληρωμή.</w:t>
+      </w:r>
+    </w:p>
+    <w:p>
+      <w:pPr>
+        <w:pStyle w:val="BodyText"/>
+        <w:numPr>
+          <w:ilvl w:val="0"/>
+          <w:numId w:val="10"/>
+        </w:numPr>
+        <w:bidi w:val="0"/>
+        <w:spacing w:before="0" w:after="140"/>
+        <w:jc w:val="left"/>
+        <w:rPr/>
+      </w:pPr>
+      <w:r>
+        <w:rPr/>
+        <w:t>Το σύστημα ανακατευθύνει τον χρήστη στο ασφαλές περιβάλλον που αντιστοιχεί στον τρόπο πληρωμής του.</w:t>
+      </w:r>
+    </w:p>
+    <w:p>
+      <w:pPr>
+        <w:pStyle w:val="BodyText"/>
+        <w:numPr>
+          <w:ilvl w:val="0"/>
+          <w:numId w:val="10"/>
+        </w:numPr>
+        <w:bidi w:val="0"/>
+        <w:jc w:val="left"/>
+        <w:rPr/>
+      </w:pPr>
+      <w:r>
+        <w:rPr>
+          <w:b w:val="false"/>
+          <w:bCs w:val="false"/>
+          <w:sz w:val="24"/>
+          <w:lang w:val="el-GR"/>
+        </w:rPr>
+        <w:t>Η περίπτωση χρήσης συνεχίζει από το βήμα 5 της βασικής ροής.</w:t>
+      </w:r>
+    </w:p>
+    <w:p>
+      <w:pPr>
+        <w:pStyle w:val="BodyText"/>
+        <w:bidi w:val="0"/>
+        <w:spacing w:before="0" w:after="140"/>
+        <w:jc w:val="left"/>
+        <w:rPr>
+          <w:lang w:val="el-GR"/>
+        </w:rPr>
+      </w:pPr>
+      <w:r>
+        <w:rPr>
+          <w:b/>
+          <w:bCs/>
+          <w:sz w:val="28"/>
+          <w:lang w:val="el-GR"/>
+        </w:rPr>
+        <w:t xml:space="preserve">Εναλλακτική Ροή </w:t>
+      </w:r>
+      <w:r>
+        <w:rPr>
+          <w:b/>
+          <w:bCs/>
+          <w:sz w:val="28"/>
+          <w:lang w:val="el-GR"/>
+        </w:rPr>
+        <w:t>4</w:t>
+      </w:r>
+    </w:p>
+    <w:p>
+      <w:pPr>
+        <w:pStyle w:val="BodyText"/>
+        <w:numPr>
+          <w:ilvl w:val="0"/>
+          <w:numId w:val="11"/>
+        </w:numPr>
+        <w:bidi w:val="0"/>
+        <w:spacing w:before="0" w:after="140"/>
+        <w:jc w:val="left"/>
+        <w:rPr/>
+      </w:pPr>
+      <w:r>
+        <w:rPr/>
+        <w:t>Ο χρήστης πάτησε το κουμπί "Ακύρωση".</w:t>
+      </w:r>
+    </w:p>
+    <w:p>
+      <w:pPr>
+        <w:pStyle w:val="BodyText"/>
+        <w:numPr>
+          <w:ilvl w:val="0"/>
+          <w:numId w:val="11"/>
+        </w:numPr>
+        <w:bidi w:val="0"/>
+        <w:spacing w:before="0" w:after="140"/>
+        <w:jc w:val="left"/>
+        <w:rPr/>
+      </w:pPr>
+      <w:r>
+        <w:rPr/>
+        <w:t>Το σύστημα</w:t>
+      </w:r>
+      <w:r>
+        <w:rPr/>
+        <w:t xml:space="preserve"> επιστρέφει τον χρήστη στην σελίδα προβολής υπηρεσίας</w:t>
+      </w:r>
+      <w:r>
+        <w:rPr/>
+        <w:t>.</w:t>
+      </w:r>
+    </w:p>
+    <w:p>
+      <w:pPr>
+        <w:pStyle w:val="Heading3"/>
+        <w:numPr>
           <w:ilvl w:val="2"/>
-          <w:numId w:val="2"/>
-        </w:numPr>
-        <w:bidi w:val="0"/>
-        <w:ind w:hanging="0" w:left="0"/>
-        <w:jc w:val="left"/>
-        <w:rPr/>
-      </w:pPr>
-      <w:r>
-        <w:rPr/>
-        <w:t>1.2.5 Μετά-συνθήκες</w:t>
+          <w:numId w:val="1"/>
+        </w:numPr>
+        <w:bidi w:val="0"/>
+        <w:ind w:hanging="0" w:left="0"/>
+        <w:jc w:val="left"/>
+        <w:rPr/>
+      </w:pPr>
+      <w:r>
+        <w:rPr/>
+        <w:t>1.3.5 Μετά-συνθήκες</w:t>
+      </w:r>
+    </w:p>
+    <w:p>
+      <w:pPr>
+        <w:pStyle w:val="BodyText"/>
+        <w:bidi w:val="0"/>
+        <w:ind w:hanging="0" w:left="0"/>
+        <w:jc w:val="left"/>
+        <w:rPr/>
+      </w:pPr>
+      <w:r>
+        <w:rPr/>
+        <w:t>Η αίτηση εγγραφής αποθηκεύεται στο σύστημα και εμφανίζεται στο προφίλ του χρήστη όπως επίσης στις ειδοποιήσεις του γυμναστή.</w:t>
+      </w:r>
+      <w:r>
+        <w:rPr/>
+        <w:commentReference w:id="1"/>
       </w:r>
     </w:p>
     <w:p>
@@ -1528,22 +2632,16 @@
         <w:pStyle w:val="Heading2"/>
         <w:numPr>
           <w:ilvl w:val="1"/>
-          <w:numId w:val="2"/>
-        </w:numPr>
-        <w:bidi w:val="0"/>
-        <w:ind w:hanging="0" w:left="0"/>
-        <w:jc w:val="left"/>
-        <w:rPr/>
-      </w:pPr>
-      <w:r>
-        <w:rPr/>
-        <w:t xml:space="preserve">1.3 </w:t>
-      </w:r>
-      <w:r>
-        <w:rPr>
-          <w:lang w:val="el-GR"/>
-        </w:rPr>
-        <w:t>Εγγραφή Σε Υπηρεσία</w:t>
+          <w:numId w:val="1"/>
+        </w:numPr>
+        <w:bidi w:val="0"/>
+        <w:ind w:hanging="0" w:left="0"/>
+        <w:jc w:val="left"/>
+        <w:rPr/>
+      </w:pPr>
+      <w:r>
+        <w:rPr/>
+        <w:t>1.4 Καταχώρηση Προόδου</w:t>
       </w:r>
     </w:p>
     <w:p>
@@ -1551,16 +2649,16 @@
         <w:pStyle w:val="Heading3"/>
         <w:numPr>
           <w:ilvl w:val="2"/>
-          <w:numId w:val="2"/>
-        </w:numPr>
-        <w:bidi w:val="0"/>
-        <w:ind w:hanging="0" w:left="0"/>
-        <w:jc w:val="left"/>
-        <w:rPr/>
-      </w:pPr>
-      <w:r>
-        <w:rPr/>
-        <w:t>1.3.1 Σύντομη Περιγραφή</w:t>
+          <w:numId w:val="1"/>
+        </w:numPr>
+        <w:bidi w:val="0"/>
+        <w:ind w:hanging="0" w:left="0"/>
+        <w:jc w:val="left"/>
+        <w:rPr/>
+      </w:pPr>
+      <w:r>
+        <w:rPr/>
+        <w:t>1.4.1 Σύντομη Περιγραφή</w:t>
       </w:r>
     </w:p>
     <w:p>
@@ -1568,16 +2666,16 @@
         <w:pStyle w:val="Heading3"/>
         <w:numPr>
           <w:ilvl w:val="2"/>
-          <w:numId w:val="2"/>
-        </w:numPr>
-        <w:bidi w:val="0"/>
-        <w:ind w:hanging="0" w:left="0"/>
-        <w:jc w:val="left"/>
-        <w:rPr/>
-      </w:pPr>
-      <w:r>
-        <w:rPr/>
-        <w:t>1.3.2 Προ-συνθήκες</w:t>
+          <w:numId w:val="1"/>
+        </w:numPr>
+        <w:bidi w:val="0"/>
+        <w:ind w:hanging="0" w:left="0"/>
+        <w:jc w:val="left"/>
+        <w:rPr/>
+      </w:pPr>
+      <w:r>
+        <w:rPr/>
+        <w:t>1.4.2 Προ-συνθήκες</w:t>
       </w:r>
     </w:p>
     <w:p>
@@ -1585,16 +2683,16 @@
         <w:pStyle w:val="Heading3"/>
         <w:numPr>
           <w:ilvl w:val="2"/>
-          <w:numId w:val="2"/>
-        </w:numPr>
-        <w:bidi w:val="0"/>
-        <w:ind w:hanging="0" w:left="0"/>
-        <w:jc w:val="left"/>
-        <w:rPr/>
-      </w:pPr>
-      <w:r>
-        <w:rPr/>
-        <w:t>1.3.3 Βασική Ροή</w:t>
+          <w:numId w:val="1"/>
+        </w:numPr>
+        <w:bidi w:val="0"/>
+        <w:ind w:hanging="0" w:left="0"/>
+        <w:jc w:val="left"/>
+        <w:rPr/>
+      </w:pPr>
+      <w:r>
+        <w:rPr/>
+        <w:t>1.4.3 Βασική Ροή</w:t>
       </w:r>
     </w:p>
     <w:p>
@@ -1602,16 +2700,16 @@
         <w:pStyle w:val="Heading3"/>
         <w:numPr>
           <w:ilvl w:val="2"/>
-          <w:numId w:val="2"/>
-        </w:numPr>
-        <w:bidi w:val="0"/>
-        <w:ind w:hanging="0" w:left="0"/>
-        <w:jc w:val="left"/>
-        <w:rPr/>
-      </w:pPr>
-      <w:r>
-        <w:rPr/>
-        <w:t>1.3.4 Εναλλακτικές Ροές</w:t>
+          <w:numId w:val="1"/>
+        </w:numPr>
+        <w:bidi w:val="0"/>
+        <w:ind w:hanging="0" w:left="0"/>
+        <w:jc w:val="left"/>
+        <w:rPr/>
+      </w:pPr>
+      <w:r>
+        <w:rPr/>
+        <w:t>1.4.4 Εναλλακτικές Ροές</w:t>
       </w:r>
     </w:p>
     <w:p>
@@ -1619,16 +2717,28 @@
         <w:pStyle w:val="Heading3"/>
         <w:numPr>
           <w:ilvl w:val="2"/>
-          <w:numId w:val="2"/>
-        </w:numPr>
-        <w:bidi w:val="0"/>
-        <w:ind w:hanging="0" w:left="0"/>
-        <w:jc w:val="left"/>
-        <w:rPr/>
-      </w:pPr>
-      <w:r>
-        <w:rPr/>
-        <w:t>1.3.5 Μετά-συνθήκες</w:t>
+          <w:numId w:val="1"/>
+        </w:numPr>
+        <w:bidi w:val="0"/>
+        <w:ind w:hanging="0" w:left="0"/>
+        <w:jc w:val="left"/>
+        <w:rPr/>
+      </w:pPr>
+      <w:r>
+        <w:rPr/>
+        <w:t>1.4.5 Μετά-συνθήκες</w:t>
+      </w:r>
+    </w:p>
+    <w:p>
+      <w:pPr>
+        <w:pStyle w:val="BodyText"/>
+        <w:bidi w:val="0"/>
+        <w:ind w:hanging="0" w:left="0"/>
+        <w:jc w:val="left"/>
+        <w:rPr/>
+      </w:pPr>
+      <w:r>
+        <w:rPr/>
       </w:r>
     </w:p>
     <w:p>
@@ -1636,16 +2746,16 @@
         <w:pStyle w:val="Heading2"/>
         <w:numPr>
           <w:ilvl w:val="1"/>
-          <w:numId w:val="2"/>
-        </w:numPr>
-        <w:bidi w:val="0"/>
-        <w:ind w:hanging="0" w:left="0"/>
-        <w:jc w:val="left"/>
-        <w:rPr/>
-      </w:pPr>
-      <w:r>
-        <w:rPr/>
-        <w:t>1.4 Καταχώρηση Προόδου</w:t>
+          <w:numId w:val="1"/>
+        </w:numPr>
+        <w:bidi w:val="0"/>
+        <w:ind w:hanging="0" w:left="0"/>
+        <w:jc w:val="left"/>
+        <w:rPr/>
+      </w:pPr>
+      <w:r>
+        <w:rPr/>
+        <w:t>1.5 Δημιουργία Εξατομικευμένου Προγράμματος</w:t>
       </w:r>
     </w:p>
     <w:p>
@@ -1653,16 +2763,16 @@
         <w:pStyle w:val="Heading3"/>
         <w:numPr>
           <w:ilvl w:val="2"/>
-          <w:numId w:val="2"/>
-        </w:numPr>
-        <w:bidi w:val="0"/>
-        <w:ind w:hanging="0" w:left="0"/>
-        <w:jc w:val="left"/>
-        <w:rPr/>
-      </w:pPr>
-      <w:r>
-        <w:rPr/>
-        <w:t>1.4.1 Σύντομη Περιγραφή</w:t>
+          <w:numId w:val="1"/>
+        </w:numPr>
+        <w:bidi w:val="0"/>
+        <w:ind w:hanging="0" w:left="0"/>
+        <w:jc w:val="left"/>
+        <w:rPr/>
+      </w:pPr>
+      <w:r>
+        <w:rPr/>
+        <w:t>1.5.1 Σύντομη Περιγραφή</w:t>
       </w:r>
     </w:p>
     <w:p>
@@ -1670,16 +2780,16 @@
         <w:pStyle w:val="Heading3"/>
         <w:numPr>
           <w:ilvl w:val="2"/>
-          <w:numId w:val="2"/>
-        </w:numPr>
-        <w:bidi w:val="0"/>
-        <w:ind w:hanging="0" w:left="0"/>
-        <w:jc w:val="left"/>
-        <w:rPr/>
-      </w:pPr>
-      <w:r>
-        <w:rPr/>
-        <w:t>1.4.2 Προ-συνθήκες</w:t>
+          <w:numId w:val="1"/>
+        </w:numPr>
+        <w:bidi w:val="0"/>
+        <w:ind w:hanging="0" w:left="0"/>
+        <w:jc w:val="left"/>
+        <w:rPr/>
+      </w:pPr>
+      <w:r>
+        <w:rPr/>
+        <w:t>1.5.2 Προ-συνθήκες</w:t>
       </w:r>
     </w:p>
     <w:p>
@@ -1687,16 +2797,16 @@
         <w:pStyle w:val="Heading3"/>
         <w:numPr>
           <w:ilvl w:val="2"/>
-          <w:numId w:val="2"/>
-        </w:numPr>
-        <w:bidi w:val="0"/>
-        <w:ind w:hanging="0" w:left="0"/>
-        <w:jc w:val="left"/>
-        <w:rPr/>
-      </w:pPr>
-      <w:r>
-        <w:rPr/>
-        <w:t>1.4.3 Βασική Ροή</w:t>
+          <w:numId w:val="1"/>
+        </w:numPr>
+        <w:bidi w:val="0"/>
+        <w:ind w:hanging="0" w:left="0"/>
+        <w:jc w:val="left"/>
+        <w:rPr/>
+      </w:pPr>
+      <w:r>
+        <w:rPr/>
+        <w:t>1.5.3 Βασική Ροή</w:t>
       </w:r>
     </w:p>
     <w:p>
@@ -1704,16 +2814,16 @@
         <w:pStyle w:val="Heading3"/>
         <w:numPr>
           <w:ilvl w:val="2"/>
-          <w:numId w:val="2"/>
-        </w:numPr>
-        <w:bidi w:val="0"/>
-        <w:ind w:hanging="0" w:left="0"/>
-        <w:jc w:val="left"/>
-        <w:rPr/>
-      </w:pPr>
-      <w:r>
-        <w:rPr/>
-        <w:t>1.4.4 Εναλλακτικές Ροές</w:t>
+          <w:numId w:val="1"/>
+        </w:numPr>
+        <w:bidi w:val="0"/>
+        <w:ind w:hanging="0" w:left="0"/>
+        <w:jc w:val="left"/>
+        <w:rPr/>
+      </w:pPr>
+      <w:r>
+        <w:rPr/>
+        <w:t>1.5.4 Εναλλακτικές Ροές</w:t>
       </w:r>
     </w:p>
     <w:p>
@@ -1721,16 +2831,28 @@
         <w:pStyle w:val="Heading3"/>
         <w:numPr>
           <w:ilvl w:val="2"/>
-          <w:numId w:val="2"/>
-        </w:numPr>
-        <w:bidi w:val="0"/>
-        <w:ind w:hanging="0" w:left="0"/>
-        <w:jc w:val="left"/>
-        <w:rPr/>
-      </w:pPr>
-      <w:r>
-        <w:rPr/>
-        <w:t>1.4.5 Μετά-συνθήκες</w:t>
+          <w:numId w:val="1"/>
+        </w:numPr>
+        <w:bidi w:val="0"/>
+        <w:ind w:hanging="0" w:left="0"/>
+        <w:jc w:val="left"/>
+        <w:rPr/>
+      </w:pPr>
+      <w:r>
+        <w:rPr/>
+        <w:t>1.5.5 Μετά-συνθήκες</w:t>
+      </w:r>
+    </w:p>
+    <w:p>
+      <w:pPr>
+        <w:pStyle w:val="BodyText"/>
+        <w:bidi w:val="0"/>
+        <w:ind w:hanging="0" w:left="0"/>
+        <w:jc w:val="left"/>
+        <w:rPr/>
+      </w:pPr>
+      <w:r>
+        <w:rPr/>
       </w:r>
     </w:p>
     <w:p>
@@ -1738,16 +2860,16 @@
         <w:pStyle w:val="Heading2"/>
         <w:numPr>
           <w:ilvl w:val="1"/>
-          <w:numId w:val="2"/>
-        </w:numPr>
-        <w:bidi w:val="0"/>
-        <w:ind w:hanging="0" w:left="0"/>
-        <w:jc w:val="left"/>
-        <w:rPr/>
-      </w:pPr>
-      <w:r>
-        <w:rPr/>
-        <w:t>1.5 Δημιουργία Εξατομικευμένου Προγράμματος</w:t>
+          <w:numId w:val="1"/>
+        </w:numPr>
+        <w:bidi w:val="0"/>
+        <w:ind w:hanging="0" w:left="0"/>
+        <w:jc w:val="left"/>
+        <w:rPr/>
+      </w:pPr>
+      <w:r>
+        <w:rPr/>
+        <w:t>1.6 Αναφορά Χρήστη / Υπηρεσίας</w:t>
       </w:r>
     </w:p>
     <w:p>
@@ -1755,16 +2877,16 @@
         <w:pStyle w:val="Heading3"/>
         <w:numPr>
           <w:ilvl w:val="2"/>
-          <w:numId w:val="2"/>
-        </w:numPr>
-        <w:bidi w:val="0"/>
-        <w:ind w:hanging="0" w:left="0"/>
-        <w:jc w:val="left"/>
-        <w:rPr/>
-      </w:pPr>
-      <w:r>
-        <w:rPr/>
-        <w:t>1.5.1 Σύντομη Περιγραφή</w:t>
+          <w:numId w:val="1"/>
+        </w:numPr>
+        <w:bidi w:val="0"/>
+        <w:ind w:hanging="0" w:left="0"/>
+        <w:jc w:val="left"/>
+        <w:rPr/>
+      </w:pPr>
+      <w:r>
+        <w:rPr/>
+        <w:t>1.6.1 Σύντομη Περιγραφή</w:t>
       </w:r>
     </w:p>
     <w:p>
@@ -1772,16 +2894,16 @@
         <w:pStyle w:val="Heading3"/>
         <w:numPr>
           <w:ilvl w:val="2"/>
-          <w:numId w:val="2"/>
-        </w:numPr>
-        <w:bidi w:val="0"/>
-        <w:ind w:hanging="0" w:left="0"/>
-        <w:jc w:val="left"/>
-        <w:rPr/>
-      </w:pPr>
-      <w:r>
-        <w:rPr/>
-        <w:t>1.5.2 Προ-συνθήκες</w:t>
+          <w:numId w:val="1"/>
+        </w:numPr>
+        <w:bidi w:val="0"/>
+        <w:ind w:hanging="0" w:left="0"/>
+        <w:jc w:val="left"/>
+        <w:rPr/>
+      </w:pPr>
+      <w:r>
+        <w:rPr/>
+        <w:t>1.6.2 Προ-συνθήκες</w:t>
       </w:r>
     </w:p>
     <w:p>
@@ -1789,16 +2911,16 @@
         <w:pStyle w:val="Heading3"/>
         <w:numPr>
           <w:ilvl w:val="2"/>
-          <w:numId w:val="2"/>
-        </w:numPr>
-        <w:bidi w:val="0"/>
-        <w:ind w:hanging="0" w:left="0"/>
-        <w:jc w:val="left"/>
-        <w:rPr/>
-      </w:pPr>
-      <w:r>
-        <w:rPr/>
-        <w:t>1.5.3 Βασική Ροή</w:t>
+          <w:numId w:val="1"/>
+        </w:numPr>
+        <w:bidi w:val="0"/>
+        <w:ind w:hanging="0" w:left="0"/>
+        <w:jc w:val="left"/>
+        <w:rPr/>
+      </w:pPr>
+      <w:r>
+        <w:rPr/>
+        <w:t>1.6.3 Βασική Ροή</w:t>
       </w:r>
     </w:p>
     <w:p>
@@ -1806,16 +2928,16 @@
         <w:pStyle w:val="Heading3"/>
         <w:numPr>
           <w:ilvl w:val="2"/>
-          <w:numId w:val="2"/>
-        </w:numPr>
-        <w:bidi w:val="0"/>
-        <w:ind w:hanging="0" w:left="0"/>
-        <w:jc w:val="left"/>
-        <w:rPr/>
-      </w:pPr>
-      <w:r>
-        <w:rPr/>
-        <w:t>1.5.4 Εναλλακτικές Ροές</w:t>
+          <w:numId w:val="1"/>
+        </w:numPr>
+        <w:bidi w:val="0"/>
+        <w:ind w:hanging="0" w:left="0"/>
+        <w:jc w:val="left"/>
+        <w:rPr/>
+      </w:pPr>
+      <w:r>
+        <w:rPr/>
+        <w:t>1.6.4 Εναλλακτικές Ροές</w:t>
       </w:r>
     </w:p>
     <w:p>
@@ -1823,16 +2945,28 @@
         <w:pStyle w:val="Heading3"/>
         <w:numPr>
           <w:ilvl w:val="2"/>
-          <w:numId w:val="2"/>
-        </w:numPr>
-        <w:bidi w:val="0"/>
-        <w:ind w:hanging="0" w:left="0"/>
-        <w:jc w:val="left"/>
-        <w:rPr/>
-      </w:pPr>
-      <w:r>
-        <w:rPr/>
-        <w:t>1.5.5 Μετά-συνθήκες</w:t>
+          <w:numId w:val="1"/>
+        </w:numPr>
+        <w:bidi w:val="0"/>
+        <w:ind w:hanging="0" w:left="0"/>
+        <w:jc w:val="left"/>
+        <w:rPr/>
+      </w:pPr>
+      <w:r>
+        <w:rPr/>
+        <w:t>1.6.5 Μετά-συνθήκες</w:t>
+      </w:r>
+    </w:p>
+    <w:p>
+      <w:pPr>
+        <w:pStyle w:val="BodyText"/>
+        <w:bidi w:val="0"/>
+        <w:ind w:hanging="0" w:left="0"/>
+        <w:jc w:val="left"/>
+        <w:rPr/>
+      </w:pPr>
+      <w:r>
+        <w:rPr/>
       </w:r>
     </w:p>
     <w:p>
@@ -1840,16 +2974,20 @@
         <w:pStyle w:val="Heading2"/>
         <w:numPr>
           <w:ilvl w:val="1"/>
-          <w:numId w:val="2"/>
-        </w:numPr>
-        <w:bidi w:val="0"/>
-        <w:ind w:hanging="0" w:left="0"/>
-        <w:jc w:val="left"/>
-        <w:rPr/>
-      </w:pPr>
-      <w:r>
-        <w:rPr/>
-        <w:t>1.6 Αναφορά Χρήστη / Υπηρεσίας</w:t>
+          <w:numId w:val="1"/>
+        </w:numPr>
+        <w:bidi w:val="0"/>
+        <w:ind w:hanging="0" w:left="0"/>
+        <w:jc w:val="left"/>
+        <w:rPr/>
+      </w:pPr>
+      <w:r>
+        <w:rPr/>
+        <w:t>1.7 Δημιουργία Προφίλ Προπονητή</w:t>
+      </w:r>
+      <w:r>
+        <w:rPr/>
+        <w:commentReference w:id="2"/>
       </w:r>
     </w:p>
     <w:p>
@@ -1857,16 +2995,16 @@
         <w:pStyle w:val="Heading3"/>
         <w:numPr>
           <w:ilvl w:val="2"/>
-          <w:numId w:val="2"/>
-        </w:numPr>
-        <w:bidi w:val="0"/>
-        <w:ind w:hanging="0" w:left="0"/>
-        <w:jc w:val="left"/>
-        <w:rPr/>
-      </w:pPr>
-      <w:r>
-        <w:rPr/>
-        <w:t>1.6.1 Σύντομη Περιγραφή</w:t>
+          <w:numId w:val="1"/>
+        </w:numPr>
+        <w:bidi w:val="0"/>
+        <w:ind w:hanging="0" w:left="0"/>
+        <w:jc w:val="left"/>
+        <w:rPr/>
+      </w:pPr>
+      <w:r>
+        <w:rPr/>
+        <w:t>1.7.1 Σύντομη Περιγραφή</w:t>
       </w:r>
     </w:p>
     <w:p>
@@ -1874,16 +3012,16 @@
         <w:pStyle w:val="Heading3"/>
         <w:numPr>
           <w:ilvl w:val="2"/>
-          <w:numId w:val="2"/>
-        </w:numPr>
-        <w:bidi w:val="0"/>
-        <w:ind w:hanging="0" w:left="0"/>
-        <w:jc w:val="left"/>
-        <w:rPr/>
-      </w:pPr>
-      <w:r>
-        <w:rPr/>
-        <w:t>1.6.2 Προ-συνθήκες</w:t>
+          <w:numId w:val="1"/>
+        </w:numPr>
+        <w:bidi w:val="0"/>
+        <w:ind w:hanging="0" w:left="0"/>
+        <w:jc w:val="left"/>
+        <w:rPr/>
+      </w:pPr>
+      <w:r>
+        <w:rPr/>
+        <w:t>1.7.2 Προ-συνθήκες</w:t>
       </w:r>
     </w:p>
     <w:p>
@@ -1891,16 +3029,16 @@
         <w:pStyle w:val="Heading3"/>
         <w:numPr>
           <w:ilvl w:val="2"/>
-          <w:numId w:val="2"/>
-        </w:numPr>
-        <w:bidi w:val="0"/>
-        <w:ind w:hanging="0" w:left="0"/>
-        <w:jc w:val="left"/>
-        <w:rPr/>
-      </w:pPr>
-      <w:r>
-        <w:rPr/>
-        <w:t>1.6.3 Βασική Ροή</w:t>
+          <w:numId w:val="1"/>
+        </w:numPr>
+        <w:bidi w:val="0"/>
+        <w:ind w:hanging="0" w:left="0"/>
+        <w:jc w:val="left"/>
+        <w:rPr/>
+      </w:pPr>
+      <w:r>
+        <w:rPr/>
+        <w:t>1.7.3 Βασική Ροή</w:t>
       </w:r>
     </w:p>
     <w:p>
@@ -1908,16 +3046,16 @@
         <w:pStyle w:val="Heading3"/>
         <w:numPr>
           <w:ilvl w:val="2"/>
-          <w:numId w:val="2"/>
-        </w:numPr>
-        <w:bidi w:val="0"/>
-        <w:ind w:hanging="0" w:left="0"/>
-        <w:jc w:val="left"/>
-        <w:rPr/>
-      </w:pPr>
-      <w:r>
-        <w:rPr/>
-        <w:t>1.6.4 Εναλλακτικές Ροές</w:t>
+          <w:numId w:val="1"/>
+        </w:numPr>
+        <w:bidi w:val="0"/>
+        <w:ind w:hanging="0" w:left="0"/>
+        <w:jc w:val="left"/>
+        <w:rPr/>
+      </w:pPr>
+      <w:r>
+        <w:rPr/>
+        <w:t>1.7.4 Εναλλακτικές Ροές</w:t>
       </w:r>
     </w:p>
     <w:p>
@@ -1925,16 +3063,28 @@
         <w:pStyle w:val="Heading3"/>
         <w:numPr>
           <w:ilvl w:val="2"/>
-          <w:numId w:val="2"/>
-        </w:numPr>
-        <w:bidi w:val="0"/>
-        <w:ind w:hanging="0" w:left="0"/>
-        <w:jc w:val="left"/>
-        <w:rPr/>
-      </w:pPr>
-      <w:r>
-        <w:rPr/>
-        <w:t>1.6.5 Μετά-συνθήκες</w:t>
+          <w:numId w:val="1"/>
+        </w:numPr>
+        <w:bidi w:val="0"/>
+        <w:ind w:hanging="0" w:left="0"/>
+        <w:jc w:val="left"/>
+        <w:rPr/>
+      </w:pPr>
+      <w:r>
+        <w:rPr/>
+        <w:t>1.7.5 Μετά-συνθήκες</w:t>
+      </w:r>
+    </w:p>
+    <w:p>
+      <w:pPr>
+        <w:pStyle w:val="BodyText"/>
+        <w:bidi w:val="0"/>
+        <w:ind w:hanging="0" w:left="0"/>
+        <w:jc w:val="left"/>
+        <w:rPr/>
+      </w:pPr>
+      <w:r>
+        <w:rPr/>
       </w:r>
     </w:p>
     <w:p>
@@ -1942,16 +3092,16 @@
         <w:pStyle w:val="Heading2"/>
         <w:numPr>
           <w:ilvl w:val="1"/>
-          <w:numId w:val="2"/>
-        </w:numPr>
-        <w:bidi w:val="0"/>
-        <w:ind w:hanging="0" w:left="0"/>
-        <w:jc w:val="left"/>
-        <w:rPr/>
-      </w:pPr>
-      <w:r>
-        <w:rPr/>
-        <w:t>1.7 Δημιουργία Προφίλ Προπονητή</w:t>
+          <w:numId w:val="1"/>
+        </w:numPr>
+        <w:bidi w:val="0"/>
+        <w:ind w:hanging="0" w:left="0"/>
+        <w:jc w:val="left"/>
+        <w:rPr/>
+      </w:pPr>
+      <w:r>
+        <w:rPr/>
+        <w:t>1.8</w:t>
       </w:r>
     </w:p>
     <w:p>
@@ -1959,16 +3109,16 @@
         <w:pStyle w:val="Heading3"/>
         <w:numPr>
           <w:ilvl w:val="2"/>
-          <w:numId w:val="2"/>
-        </w:numPr>
-        <w:bidi w:val="0"/>
-        <w:ind w:hanging="0" w:left="0"/>
-        <w:jc w:val="left"/>
-        <w:rPr/>
-      </w:pPr>
-      <w:r>
-        <w:rPr/>
-        <w:t>1.7.1 Σύντομη Περιγραφή</w:t>
+          <w:numId w:val="1"/>
+        </w:numPr>
+        <w:bidi w:val="0"/>
+        <w:ind w:hanging="0" w:left="0"/>
+        <w:jc w:val="left"/>
+        <w:rPr/>
+      </w:pPr>
+      <w:r>
+        <w:rPr/>
+        <w:t>1.8.1 Σύντομη Περιγραφή</w:t>
       </w:r>
     </w:p>
     <w:p>
@@ -1976,16 +3126,16 @@
         <w:pStyle w:val="Heading3"/>
         <w:numPr>
           <w:ilvl w:val="2"/>
-          <w:numId w:val="2"/>
-        </w:numPr>
-        <w:bidi w:val="0"/>
-        <w:ind w:hanging="0" w:left="0"/>
-        <w:jc w:val="left"/>
-        <w:rPr/>
-      </w:pPr>
-      <w:r>
-        <w:rPr/>
-        <w:t>1.7.2 Προ-συνθήκες</w:t>
+          <w:numId w:val="1"/>
+        </w:numPr>
+        <w:bidi w:val="0"/>
+        <w:ind w:hanging="0" w:left="0"/>
+        <w:jc w:val="left"/>
+        <w:rPr/>
+      </w:pPr>
+      <w:r>
+        <w:rPr/>
+        <w:t>1.8.2 Προ-συνθήκες</w:t>
       </w:r>
     </w:p>
     <w:p>
@@ -1993,16 +3143,16 @@
         <w:pStyle w:val="Heading3"/>
         <w:numPr>
           <w:ilvl w:val="2"/>
-          <w:numId w:val="2"/>
-        </w:numPr>
-        <w:bidi w:val="0"/>
-        <w:ind w:hanging="0" w:left="0"/>
-        <w:jc w:val="left"/>
-        <w:rPr/>
-      </w:pPr>
-      <w:r>
-        <w:rPr/>
-        <w:t>1.7.3 Βασική Ροή</w:t>
+          <w:numId w:val="1"/>
+        </w:numPr>
+        <w:bidi w:val="0"/>
+        <w:ind w:hanging="0" w:left="0"/>
+        <w:jc w:val="left"/>
+        <w:rPr/>
+      </w:pPr>
+      <w:r>
+        <w:rPr/>
+        <w:t>1.8.3 Βασική Ροή</w:t>
       </w:r>
     </w:p>
     <w:p>
@@ -2010,16 +3160,16 @@
         <w:pStyle w:val="Heading3"/>
         <w:numPr>
           <w:ilvl w:val="2"/>
-          <w:numId w:val="2"/>
-        </w:numPr>
-        <w:bidi w:val="0"/>
-        <w:ind w:hanging="0" w:left="0"/>
-        <w:jc w:val="left"/>
-        <w:rPr/>
-      </w:pPr>
-      <w:r>
-        <w:rPr/>
-        <w:t>1.7.4 Εναλλακτικές Ροές</w:t>
+          <w:numId w:val="1"/>
+        </w:numPr>
+        <w:bidi w:val="0"/>
+        <w:ind w:hanging="0" w:left="0"/>
+        <w:jc w:val="left"/>
+        <w:rPr/>
+      </w:pPr>
+      <w:r>
+        <w:rPr/>
+        <w:t>1.8.4 Εναλλακτικές Ροές</w:t>
       </w:r>
     </w:p>
     <w:p>
@@ -2027,16 +3177,28 @@
         <w:pStyle w:val="Heading3"/>
         <w:numPr>
           <w:ilvl w:val="2"/>
-          <w:numId w:val="2"/>
-        </w:numPr>
-        <w:bidi w:val="0"/>
-        <w:ind w:hanging="0" w:left="0"/>
-        <w:jc w:val="left"/>
-        <w:rPr/>
-      </w:pPr>
-      <w:r>
-        <w:rPr/>
-        <w:t>1.7.5 Μετά-συνθήκες</w:t>
+          <w:numId w:val="1"/>
+        </w:numPr>
+        <w:bidi w:val="0"/>
+        <w:ind w:hanging="0" w:left="0"/>
+        <w:jc w:val="left"/>
+        <w:rPr/>
+      </w:pPr>
+      <w:r>
+        <w:rPr/>
+        <w:t>1.8.5 Μετά-συνθήκες</w:t>
+      </w:r>
+    </w:p>
+    <w:p>
+      <w:pPr>
+        <w:pStyle w:val="BodyText"/>
+        <w:bidi w:val="0"/>
+        <w:ind w:hanging="0" w:left="0"/>
+        <w:jc w:val="left"/>
+        <w:rPr/>
+      </w:pPr>
+      <w:r>
+        <w:rPr/>
       </w:r>
     </w:p>
     <w:p>
@@ -2044,16 +3206,16 @@
         <w:pStyle w:val="Heading2"/>
         <w:numPr>
           <w:ilvl w:val="1"/>
-          <w:numId w:val="2"/>
-        </w:numPr>
-        <w:bidi w:val="0"/>
-        <w:ind w:hanging="0" w:left="0"/>
-        <w:jc w:val="left"/>
-        <w:rPr/>
-      </w:pPr>
-      <w:r>
-        <w:rPr/>
-        <w:t>1.8</w:t>
+          <w:numId w:val="1"/>
+        </w:numPr>
+        <w:bidi w:val="0"/>
+        <w:ind w:hanging="0" w:left="0"/>
+        <w:jc w:val="left"/>
+        <w:rPr/>
+      </w:pPr>
+      <w:r>
+        <w:rPr/>
+        <w:t>1.9</w:t>
       </w:r>
     </w:p>
     <w:p>
@@ -2061,16 +3223,16 @@
         <w:pStyle w:val="Heading3"/>
         <w:numPr>
           <w:ilvl w:val="2"/>
-          <w:numId w:val="2"/>
-        </w:numPr>
-        <w:bidi w:val="0"/>
-        <w:ind w:hanging="0" w:left="0"/>
-        <w:jc w:val="left"/>
-        <w:rPr/>
-      </w:pPr>
-      <w:r>
-        <w:rPr/>
-        <w:t>1.8.1 Σύντομη Περιγραφή</w:t>
+          <w:numId w:val="1"/>
+        </w:numPr>
+        <w:bidi w:val="0"/>
+        <w:ind w:hanging="0" w:left="0"/>
+        <w:jc w:val="left"/>
+        <w:rPr/>
+      </w:pPr>
+      <w:r>
+        <w:rPr/>
+        <w:t>1.9.1 Σύντομη Περιγραφή</w:t>
       </w:r>
     </w:p>
     <w:p>
@@ -2078,16 +3240,16 @@
         <w:pStyle w:val="Heading3"/>
         <w:numPr>
           <w:ilvl w:val="2"/>
-          <w:numId w:val="2"/>
-        </w:numPr>
-        <w:bidi w:val="0"/>
-        <w:ind w:hanging="0" w:left="0"/>
-        <w:jc w:val="left"/>
-        <w:rPr/>
-      </w:pPr>
-      <w:r>
-        <w:rPr/>
-        <w:t>1.8.2 Προ-συνθήκες</w:t>
+          <w:numId w:val="1"/>
+        </w:numPr>
+        <w:bidi w:val="0"/>
+        <w:ind w:hanging="0" w:left="0"/>
+        <w:jc w:val="left"/>
+        <w:rPr/>
+      </w:pPr>
+      <w:r>
+        <w:rPr/>
+        <w:t>1.9.2 Προ-συνθήκες</w:t>
       </w:r>
     </w:p>
     <w:p>
@@ -2095,16 +3257,16 @@
         <w:pStyle w:val="Heading3"/>
         <w:numPr>
           <w:ilvl w:val="2"/>
-          <w:numId w:val="2"/>
-        </w:numPr>
-        <w:bidi w:val="0"/>
-        <w:ind w:hanging="0" w:left="0"/>
-        <w:jc w:val="left"/>
-        <w:rPr/>
-      </w:pPr>
-      <w:r>
-        <w:rPr/>
-        <w:t>1.8.3 Βασική Ροή</w:t>
+          <w:numId w:val="1"/>
+        </w:numPr>
+        <w:bidi w:val="0"/>
+        <w:ind w:hanging="0" w:left="0"/>
+        <w:jc w:val="left"/>
+        <w:rPr/>
+      </w:pPr>
+      <w:r>
+        <w:rPr/>
+        <w:t>1.9.3 Βασική Ροή</w:t>
       </w:r>
     </w:p>
     <w:p>
@@ -2112,16 +3274,16 @@
         <w:pStyle w:val="Heading3"/>
         <w:numPr>
           <w:ilvl w:val="2"/>
-          <w:numId w:val="2"/>
-        </w:numPr>
-        <w:bidi w:val="0"/>
-        <w:ind w:hanging="0" w:left="0"/>
-        <w:jc w:val="left"/>
-        <w:rPr/>
-      </w:pPr>
-      <w:r>
-        <w:rPr/>
-        <w:t>1.8.4 Εναλλακτικές Ροές</w:t>
+          <w:numId w:val="1"/>
+        </w:numPr>
+        <w:bidi w:val="0"/>
+        <w:ind w:hanging="0" w:left="0"/>
+        <w:jc w:val="left"/>
+        <w:rPr/>
+      </w:pPr>
+      <w:r>
+        <w:rPr/>
+        <w:t>1.9.4 Εναλλακτικές Ροές</w:t>
       </w:r>
     </w:p>
     <w:p>
@@ -2129,16 +3291,28 @@
         <w:pStyle w:val="Heading3"/>
         <w:numPr>
           <w:ilvl w:val="2"/>
-          <w:numId w:val="2"/>
-        </w:numPr>
-        <w:bidi w:val="0"/>
-        <w:ind w:hanging="0" w:left="0"/>
-        <w:jc w:val="left"/>
-        <w:rPr/>
-      </w:pPr>
-      <w:r>
-        <w:rPr/>
-        <w:t>1.8.5 Μετά-συνθήκες</w:t>
+          <w:numId w:val="1"/>
+        </w:numPr>
+        <w:bidi w:val="0"/>
+        <w:ind w:hanging="0" w:left="0"/>
+        <w:jc w:val="left"/>
+        <w:rPr/>
+      </w:pPr>
+      <w:r>
+        <w:rPr/>
+        <w:t>1.9.5 Μετά-συνθήκες</w:t>
+      </w:r>
+    </w:p>
+    <w:p>
+      <w:pPr>
+        <w:pStyle w:val="BodyText"/>
+        <w:bidi w:val="0"/>
+        <w:ind w:hanging="0" w:left="0"/>
+        <w:jc w:val="left"/>
+        <w:rPr/>
+      </w:pPr>
+      <w:r>
+        <w:rPr/>
       </w:r>
     </w:p>
     <w:p>
@@ -2146,16 +3320,22 @@
         <w:pStyle w:val="Heading2"/>
         <w:numPr>
           <w:ilvl w:val="1"/>
-          <w:numId w:val="2"/>
-        </w:numPr>
-        <w:bidi w:val="0"/>
-        <w:ind w:hanging="0" w:left="0"/>
-        <w:jc w:val="left"/>
-        <w:rPr/>
-      </w:pPr>
-      <w:r>
-        <w:rPr/>
-        <w:t>1.9</w:t>
+          <w:numId w:val="1"/>
+        </w:numPr>
+        <w:bidi w:val="0"/>
+        <w:ind w:hanging="0" w:left="0"/>
+        <w:jc w:val="left"/>
+        <w:rPr/>
+      </w:pPr>
+      <w:r>
+        <w:rPr/>
+        <w:t>1.</w:t>
+      </w:r>
+      <w:r>
+        <w:rPr>
+          <w:lang w:val="en-US"/>
+        </w:rPr>
+        <w:t>10</w:t>
       </w:r>
     </w:p>
     <w:p>
@@ -2163,16 +3343,26 @@
         <w:pStyle w:val="Heading3"/>
         <w:numPr>
           <w:ilvl w:val="2"/>
-          <w:numId w:val="2"/>
-        </w:numPr>
-        <w:bidi w:val="0"/>
-        <w:ind w:hanging="0" w:left="0"/>
-        <w:jc w:val="left"/>
-        <w:rPr/>
-      </w:pPr>
-      <w:r>
-        <w:rPr/>
-        <w:t>1.9.1 Σύντομη Περιγραφή</w:t>
+          <w:numId w:val="1"/>
+        </w:numPr>
+        <w:bidi w:val="0"/>
+        <w:ind w:hanging="0" w:left="0"/>
+        <w:jc w:val="left"/>
+        <w:rPr/>
+      </w:pPr>
+      <w:r>
+        <w:rPr/>
+        <w:t>1.</w:t>
+      </w:r>
+      <w:r>
+        <w:rPr>
+          <w:lang w:val="en-US"/>
+        </w:rPr>
+        <w:t>10</w:t>
+      </w:r>
+      <w:r>
+        <w:rPr/>
+        <w:t>.1 Σύντομη Περιγραφή</w:t>
       </w:r>
     </w:p>
     <w:p>
@@ -2180,16 +3370,26 @@
         <w:pStyle w:val="Heading3"/>
         <w:numPr>
           <w:ilvl w:val="2"/>
-          <w:numId w:val="2"/>
-        </w:numPr>
-        <w:bidi w:val="0"/>
-        <w:ind w:hanging="0" w:left="0"/>
-        <w:jc w:val="left"/>
-        <w:rPr/>
-      </w:pPr>
-      <w:r>
-        <w:rPr/>
-        <w:t>1.9.2 Προ-συνθήκες</w:t>
+          <w:numId w:val="1"/>
+        </w:numPr>
+        <w:bidi w:val="0"/>
+        <w:ind w:hanging="0" w:left="0"/>
+        <w:jc w:val="left"/>
+        <w:rPr/>
+      </w:pPr>
+      <w:r>
+        <w:rPr/>
+        <w:t>1.</w:t>
+      </w:r>
+      <w:r>
+        <w:rPr>
+          <w:lang w:val="en-US"/>
+        </w:rPr>
+        <w:t>10</w:t>
+      </w:r>
+      <w:r>
+        <w:rPr/>
+        <w:t>.2 Προ-συνθήκες</w:t>
       </w:r>
     </w:p>
     <w:p>
@@ -2197,16 +3397,26 @@
         <w:pStyle w:val="Heading3"/>
         <w:numPr>
           <w:ilvl w:val="2"/>
-          <w:numId w:val="2"/>
-        </w:numPr>
-        <w:bidi w:val="0"/>
-        <w:ind w:hanging="0" w:left="0"/>
-        <w:jc w:val="left"/>
-        <w:rPr/>
-      </w:pPr>
-      <w:r>
-        <w:rPr/>
-        <w:t>1.9.3 Βασική Ροή</w:t>
+          <w:numId w:val="1"/>
+        </w:numPr>
+        <w:bidi w:val="0"/>
+        <w:ind w:hanging="0" w:left="0"/>
+        <w:jc w:val="left"/>
+        <w:rPr/>
+      </w:pPr>
+      <w:r>
+        <w:rPr/>
+        <w:t>1.</w:t>
+      </w:r>
+      <w:r>
+        <w:rPr>
+          <w:lang w:val="en-US"/>
+        </w:rPr>
+        <w:t>10</w:t>
+      </w:r>
+      <w:r>
+        <w:rPr/>
+        <w:t>.3 Βασική Ροή</w:t>
       </w:r>
     </w:p>
     <w:p>
@@ -2214,16 +3424,26 @@
         <w:pStyle w:val="Heading3"/>
         <w:numPr>
           <w:ilvl w:val="2"/>
-          <w:numId w:val="2"/>
-        </w:numPr>
-        <w:bidi w:val="0"/>
-        <w:ind w:hanging="0" w:left="0"/>
-        <w:jc w:val="left"/>
-        <w:rPr/>
-      </w:pPr>
-      <w:r>
-        <w:rPr/>
-        <w:t>1.9.4 Εναλλακτικές Ροές</w:t>
+          <w:numId w:val="1"/>
+        </w:numPr>
+        <w:bidi w:val="0"/>
+        <w:ind w:hanging="0" w:left="0"/>
+        <w:jc w:val="left"/>
+        <w:rPr/>
+      </w:pPr>
+      <w:r>
+        <w:rPr/>
+        <w:t>1.</w:t>
+      </w:r>
+      <w:r>
+        <w:rPr>
+          <w:lang w:val="en-US"/>
+        </w:rPr>
+        <w:t>10</w:t>
+      </w:r>
+      <w:r>
+        <w:rPr/>
+        <w:t>.4 Εναλλακτικές Ροές</w:t>
       </w:r>
     </w:p>
     <w:p>
@@ -2231,155 +3451,7 @@
         <w:pStyle w:val="Heading3"/>
         <w:numPr>
           <w:ilvl w:val="2"/>
-          <w:numId w:val="2"/>
-        </w:numPr>
-        <w:bidi w:val="0"/>
-        <w:ind w:hanging="0" w:left="0"/>
-        <w:jc w:val="left"/>
-        <w:rPr/>
-      </w:pPr>
-      <w:r>
-        <w:rPr/>
-        <w:t>1.9.5 Μετά-συνθήκες</w:t>
-      </w:r>
-    </w:p>
-    <w:p>
-      <w:pPr>
-        <w:pStyle w:val="Heading2"/>
-        <w:numPr>
-          <w:ilvl w:val="1"/>
-          <w:numId w:val="2"/>
-        </w:numPr>
-        <w:bidi w:val="0"/>
-        <w:ind w:hanging="0" w:left="0"/>
-        <w:jc w:val="left"/>
-        <w:rPr/>
-      </w:pPr>
-      <w:r>
-        <w:rPr/>
-        <w:t>1.</w:t>
-      </w:r>
-      <w:r>
-        <w:rPr>
-          <w:lang w:val="en-US"/>
-        </w:rPr>
-        <w:t>10</w:t>
-      </w:r>
-    </w:p>
-    <w:p>
-      <w:pPr>
-        <w:pStyle w:val="Heading3"/>
-        <w:numPr>
-          <w:ilvl w:val="2"/>
-          <w:numId w:val="2"/>
-        </w:numPr>
-        <w:bidi w:val="0"/>
-        <w:ind w:hanging="0" w:left="0"/>
-        <w:jc w:val="left"/>
-        <w:rPr/>
-      </w:pPr>
-      <w:r>
-        <w:rPr/>
-        <w:t>1.</w:t>
-      </w:r>
-      <w:r>
-        <w:rPr>
-          <w:lang w:val="en-US"/>
-        </w:rPr>
-        <w:t>10</w:t>
-      </w:r>
-      <w:r>
-        <w:rPr/>
-        <w:t>.1 Σύντομη Περιγραφή</w:t>
-      </w:r>
-    </w:p>
-    <w:p>
-      <w:pPr>
-        <w:pStyle w:val="Heading3"/>
-        <w:numPr>
-          <w:ilvl w:val="2"/>
-          <w:numId w:val="2"/>
-        </w:numPr>
-        <w:bidi w:val="0"/>
-        <w:ind w:hanging="0" w:left="0"/>
-        <w:jc w:val="left"/>
-        <w:rPr/>
-      </w:pPr>
-      <w:r>
-        <w:rPr/>
-        <w:t>1.</w:t>
-      </w:r>
-      <w:r>
-        <w:rPr>
-          <w:lang w:val="en-US"/>
-        </w:rPr>
-        <w:t>10</w:t>
-      </w:r>
-      <w:r>
-        <w:rPr/>
-        <w:t>.2 Προ-συνθήκες</w:t>
-      </w:r>
-    </w:p>
-    <w:p>
-      <w:pPr>
-        <w:pStyle w:val="Heading3"/>
-        <w:numPr>
-          <w:ilvl w:val="2"/>
-          <w:numId w:val="2"/>
-        </w:numPr>
-        <w:bidi w:val="0"/>
-        <w:ind w:hanging="0" w:left="0"/>
-        <w:jc w:val="left"/>
-        <w:rPr/>
-      </w:pPr>
-      <w:r>
-        <w:rPr/>
-        <w:t>1.</w:t>
-      </w:r>
-      <w:r>
-        <w:rPr>
-          <w:lang w:val="en-US"/>
-        </w:rPr>
-        <w:t>10</w:t>
-      </w:r>
-      <w:r>
-        <w:rPr/>
-        <w:t>.3 Βασική Ροή</w:t>
-      </w:r>
-    </w:p>
-    <w:p>
-      <w:pPr>
-        <w:pStyle w:val="Heading3"/>
-        <w:numPr>
-          <w:ilvl w:val="2"/>
-          <w:numId w:val="2"/>
-        </w:numPr>
-        <w:bidi w:val="0"/>
-        <w:ind w:hanging="0" w:left="0"/>
-        <w:jc w:val="left"/>
-        <w:rPr/>
-      </w:pPr>
-      <w:r>
-        <w:rPr/>
-        <w:t>1.</w:t>
-      </w:r>
-      <w:r>
-        <w:rPr>
-          <w:lang w:val="en-US"/>
-        </w:rPr>
-        <w:t>10</w:t>
-      </w:r>
-      <w:r>
-        <w:rPr/>
-        <w:t>.4 Εναλλακτικές Ροές</w:t>
-      </w:r>
-    </w:p>
-    <w:p>
-      <w:pPr>
-        <w:pStyle w:val="Heading3"/>
-        <w:numPr>
-          <w:ilvl w:val="2"/>
-          <w:numId w:val="2"/>
+          <w:numId w:val="1"/>
         </w:numPr>
         <w:rPr/>
       </w:pPr>
@@ -2425,7 +3497,8 @@
       </w:r>
     </w:p>
     <w:sectPr>
-      <w:footerReference w:type="default" r:id="rId3"/>
+      <w:footerReference w:type="even" r:id="rId3"/>
+      <w:footerReference w:type="default" r:id="rId4"/>
       <w:type w:val="nextPage"/>
       <w:pgSz w:w="11906" w:h="16838"/>
       <w:pgMar w:left="1136" w:right="1136" w:gutter="0" w:header="0" w:top="1136" w:footer="1136" w:bottom="1695"/>
@@ -2438,7 +3511,88 @@
 </w:document>
 </file>
 
+<file path=word/comments.xml><?xml version="1.0" encoding="utf-8"?>
+<w:comments xmlns:o="urn:schemas-microsoft-com:office:office" xmlns:r="http://schemas.openxmlformats.org/officeDocument/2006/relationships" xmlns:v="urn:schemas-microsoft-com:vml" xmlns:w="http://schemas.openxmlformats.org/wordprocessingml/2006/main" xmlns:w10="urn:schemas-microsoft-com:office:word" xmlns:wp="http://schemas.openxmlformats.org/drawingml/2006/wordprocessingDrawing" xmlns:pic="http://schemas.openxmlformats.org/drawingml/2006/picture" xmlns:wps="http://schemas.microsoft.com/office/word/2010/wordprocessingShape" xmlns:wpg="http://schemas.microsoft.com/office/word/2010/wordprocessingGroup" xmlns:mc="http://schemas.openxmlformats.org/markup-compatibility/2006" xmlns:wp14="http://schemas.microsoft.com/office/word/2010/wordprocessingDrawing" xmlns:w14="http://schemas.microsoft.com/office/word/2010/wordml" xmlns:w15="http://schemas.microsoft.com/office/word/2012/wordml" mc:Ignorable="w14 wp14 w15">
+  <w:comment w:id="0" w:author="Xerxis Vougiouklis" w:date="2025-03-24T14:36:52Z" w:initials="XV">
+    <w:p>
+      <w:pPr>
+        <w:overflowPunct w:val="false"/>
+        <w:rPr/>
+      </w:pPr>
+      <w:r>
+        <w:rPr>
+          <w:rFonts w:eastAsia="Segoe UI" w:cs="Tahoma"/>
+          <w:kern w:val="0"/>
+          <w:lang w:val="en-US" w:eastAsia="en-US" w:bidi="en-US"/>
+        </w:rPr>
+        <w:t>Παραείναι απλή αυτή. Αν δεν έχετε ιδέες για να την επεκτείνουμε ας ζητήσουμε να μην βαθμολογηθούμε σε αυτή.</w:t>
+      </w:r>
+    </w:p>
+  </w:comment>
+  <w:comment w:id="1" w:author="Xerxis Vougiouklis" w:date="2025-03-24T14:16:13Z" w:initials="XV">
+    <w:p>
+      <w:pPr>
+        <w:overflowPunct w:val="false"/>
+        <w:rPr/>
+      </w:pPr>
+      <w:r>
+        <w:rPr>
+          <w:rFonts w:eastAsia="Segoe UI" w:cs="Tahoma"/>
+          <w:kern w:val="0"/>
+          <w:lang w:val="en-US" w:eastAsia="en-US" w:bidi="en-US"/>
+        </w:rPr>
+        <w:t>Δεν έχω κάνει ακόμα εικόνα πως θα είναι αυτό. Θα εμφανίζεται ως ειδοποίηση ή θα έχει ο γυμναστής μια οθόνη επεξεργασίας συνδρομητών;</w:t>
+      </w:r>
+    </w:p>
+  </w:comment>
+  <w:comment w:id="2" w:author="Xerxis Vougiouklis" w:date="2025-03-24T14:17:50Z" w:initials="XV">
+    <w:p>
+      <w:pPr>
+        <w:overflowPunct w:val="false"/>
+        <w:rPr/>
+      </w:pPr>
+      <w:r>
+        <w:rPr>
+          <w:rFonts w:eastAsia="Segoe UI" w:cs="Tahoma"/>
+          <w:kern w:val="0"/>
+          <w:lang w:val="en-US" w:eastAsia="en-US" w:bidi="en-US"/>
+        </w:rPr>
+        <w:t>Το UC ενός κανονικού χρήστη είναι απλό αλλά για τον γυμναστή σκεφτόμουν να τον βάλουμε να περάσει έγγραφα που να επιβεβαιώνουν την ικανότητα του. Πχ χαρτί παν/μιου ή κάποια βεβαίωση εργασίας σε γυμναστήριο. Αν υποθέσουμε ότι η διαδικασία επικύρωσης δεν είναι αυτόματη τότε έχουμε την δυνατότητα να φτιάξουμε και UCs για admins/validators.</w:t>
+      </w:r>
+    </w:p>
+    <w:p>
+      <w:pPr>
+        <w:overflowPunct w:val="false"/>
+        <w:rPr/>
+      </w:pPr>
+      <w:r>
+        <w:rPr>
+          <w:rFonts w:eastAsia="Segoe UI" w:cs="Tahoma"/>
+          <w:kern w:val="0"/>
+          <w:lang w:val="en-US" w:eastAsia="en-US" w:bidi="en-US"/>
+        </w:rPr>
+        <w:t>Η αναφορά χρήστη / υπηρεσίας είναι κάτι ακόμα που θα μπορούσαν να αναλάβουν οι admins</w:t>
+      </w:r>
+    </w:p>
+  </w:comment>
+</w:comments>
+</file>
+
 <file path=word/footer1.xml><?xml version="1.0" encoding="utf-8"?>
+<w:ftr xmlns:o="urn:schemas-microsoft-com:office:office" xmlns:r="http://schemas.openxmlformats.org/officeDocument/2006/relationships" xmlns:v="urn:schemas-microsoft-com:vml" xmlns:w="http://schemas.openxmlformats.org/wordprocessingml/2006/main" xmlns:w10="urn:schemas-microsoft-com:office:word" xmlns:wp="http://schemas.openxmlformats.org/drawingml/2006/wordprocessingDrawing" xmlns:pic="http://schemas.openxmlformats.org/drawingml/2006/picture" xmlns:wps="http://schemas.microsoft.com/office/word/2010/wordprocessingShape" xmlns:wpg="http://schemas.microsoft.com/office/word/2010/wordprocessingGroup" xmlns:mc="http://schemas.openxmlformats.org/markup-compatibility/2006" xmlns:wp14="http://schemas.microsoft.com/office/word/2010/wordprocessingDrawing" xmlns:w14="http://schemas.microsoft.com/office/word/2010/wordml" xmlns:w15="http://schemas.microsoft.com/office/word/2012/wordml" mc:Ignorable="w14 wp14 w15">
+  <w:p>
+    <w:pPr>
+      <w:pStyle w:val="Footer"/>
+      <w:rPr/>
+    </w:pPr>
+    <w:r>
+      <w:rPr/>
+    </w:r>
+  </w:p>
+</w:ftr>
+</file>
+
+<file path=word/footer2.xml><?xml version="1.0" encoding="utf-8"?>
 <w:ftr xmlns:o="urn:schemas-microsoft-com:office:office" xmlns:r="http://schemas.openxmlformats.org/officeDocument/2006/relationships" xmlns:v="urn:schemas-microsoft-com:vml" xmlns:w="http://schemas.openxmlformats.org/wordprocessingml/2006/main" xmlns:w10="urn:schemas-microsoft-com:office:word" xmlns:wp="http://schemas.openxmlformats.org/drawingml/2006/wordprocessingDrawing" xmlns:pic="http://schemas.openxmlformats.org/drawingml/2006/picture" xmlns:wps="http://schemas.microsoft.com/office/word/2010/wordprocessingShape" xmlns:wpg="http://schemas.microsoft.com/office/word/2010/wordprocessingGroup" xmlns:mc="http://schemas.openxmlformats.org/markup-compatibility/2006" xmlns:wp14="http://schemas.microsoft.com/office/word/2010/wordprocessingDrawing" xmlns:w14="http://schemas.microsoft.com/office/word/2010/wordml" xmlns:w15="http://schemas.microsoft.com/office/word/2012/wordml" mc:Ignorable="w14 wp14 w15">
   <w:p>
     <w:pPr>
@@ -2462,7 +3616,7 @@
     </w:r>
     <w:r>
       <w:rPr/>
-      <w:t>5</w:t>
+      <w:t>7</w:t>
     </w:r>
     <w:r>
       <w:rPr/>
@@ -2488,6 +3642,7 @@
         </w:tabs>
         <w:ind w:left="0" w:hanging="0"/>
       </w:pPr>
+      <w:rPr/>
     </w:lvl>
     <w:lvl w:ilvl="1">
       <w:start w:val="1"/>
@@ -2501,6 +3656,7 @@
         </w:tabs>
         <w:ind w:left="0" w:hanging="0"/>
       </w:pPr>
+      <w:rPr/>
     </w:lvl>
     <w:lvl w:ilvl="2">
       <w:start w:val="1"/>
@@ -2514,6 +3670,7 @@
         </w:tabs>
         <w:ind w:left="0" w:hanging="0"/>
       </w:pPr>
+      <w:rPr/>
     </w:lvl>
     <w:lvl w:ilvl="3">
       <w:start w:val="1"/>
@@ -2527,6 +3684,7 @@
         </w:tabs>
         <w:ind w:left="0" w:hanging="0"/>
       </w:pPr>
+      <w:rPr/>
     </w:lvl>
     <w:lvl w:ilvl="4">
       <w:start w:val="1"/>
@@ -2540,6 +3698,7 @@
         </w:tabs>
         <w:ind w:left="0" w:hanging="0"/>
       </w:pPr>
+      <w:rPr/>
     </w:lvl>
     <w:lvl w:ilvl="5">
       <w:start w:val="1"/>
@@ -2553,6 +3712,7 @@
         </w:tabs>
         <w:ind w:left="0" w:hanging="0"/>
       </w:pPr>
+      <w:rPr/>
     </w:lvl>
     <w:lvl w:ilvl="6">
       <w:start w:val="1"/>
@@ -2566,6 +3726,7 @@
         </w:tabs>
         <w:ind w:left="0" w:hanging="0"/>
       </w:pPr>
+      <w:rPr/>
     </w:lvl>
     <w:lvl w:ilvl="7">
       <w:start w:val="1"/>
@@ -2579,6 +3740,7 @@
         </w:tabs>
         <w:ind w:left="0" w:hanging="0"/>
       </w:pPr>
+      <w:rPr/>
     </w:lvl>
     <w:lvl w:ilvl="8">
       <w:start w:val="1"/>
@@ -2592,141 +3754,151 @@
         </w:tabs>
         <w:ind w:left="0" w:hanging="0"/>
       </w:pPr>
+      <w:rPr/>
     </w:lvl>
   </w:abstractNum>
   <w:abstractNum w:abstractNumId="2">
     <w:lvl w:ilvl="0">
       <w:start w:val="1"/>
-      <w:numFmt w:val="none"/>
-      <w:suff w:val="nothing"/>
-      <w:lvlText w:val="%1"/>
-      <w:lvlJc w:val="left"/>
-      <w:pPr>
-        <w:tabs>
-          <w:tab w:val="num" w:pos="0"/>
-        </w:tabs>
-        <w:ind w:left="0" w:hanging="0"/>
-      </w:pPr>
-      <w:rPr/>
+      <w:numFmt w:val="bullet"/>
+      <w:lvlText w:val=""/>
+      <w:lvlJc w:val="left"/>
+      <w:pPr>
+        <w:tabs>
+          <w:tab w:val="num" w:pos="720"/>
+        </w:tabs>
+        <w:ind w:left="720" w:hanging="360"/>
+      </w:pPr>
+      <w:rPr>
+        <w:rFonts w:ascii="Symbol" w:hAnsi="Symbol" w:cs="Symbol" w:hint="default"/>
+      </w:rPr>
     </w:lvl>
     <w:lvl w:ilvl="1">
       <w:start w:val="1"/>
-      <w:numFmt w:val="none"/>
-      <w:suff w:val="nothing"/>
-      <w:lvlText w:val="%2"/>
-      <w:lvlJc w:val="left"/>
-      <w:pPr>
-        <w:tabs>
-          <w:tab w:val="num" w:pos="0"/>
-        </w:tabs>
-        <w:ind w:left="0" w:hanging="0"/>
-      </w:pPr>
-      <w:rPr/>
+      <w:numFmt w:val="bullet"/>
+      <w:lvlText w:val="◦"/>
+      <w:lvlJc w:val="left"/>
+      <w:pPr>
+        <w:tabs>
+          <w:tab w:val="num" w:pos="1080"/>
+        </w:tabs>
+        <w:ind w:left="1080" w:hanging="360"/>
+      </w:pPr>
+      <w:rPr>
+        <w:rFonts w:ascii="OpenSymbol" w:hAnsi="OpenSymbol" w:cs="OpenSymbol" w:hint="default"/>
+      </w:rPr>
     </w:lvl>
     <w:lvl w:ilvl="2">
       <w:start w:val="1"/>
-      <w:numFmt w:val="none"/>
-      <w:suff w:val="nothing"/>
-      <w:lvlText w:val="%3"/>
-      <w:lvlJc w:val="left"/>
-      <w:pPr>
-        <w:tabs>
-          <w:tab w:val="num" w:pos="0"/>
-        </w:tabs>
-        <w:ind w:left="0" w:hanging="0"/>
-      </w:pPr>
-      <w:rPr/>
+      <w:numFmt w:val="bullet"/>
+      <w:lvlText w:val="▪"/>
+      <w:lvlJc w:val="left"/>
+      <w:pPr>
+        <w:tabs>
+          <w:tab w:val="num" w:pos="1440"/>
+        </w:tabs>
+        <w:ind w:left="1440" w:hanging="360"/>
+      </w:pPr>
+      <w:rPr>
+        <w:rFonts w:ascii="OpenSymbol" w:hAnsi="OpenSymbol" w:cs="OpenSymbol" w:hint="default"/>
+      </w:rPr>
     </w:lvl>
     <w:lvl w:ilvl="3">
       <w:start w:val="1"/>
-      <w:numFmt w:val="none"/>
-      <w:suff w:val="nothing"/>
-      <w:lvlText w:val="%4"/>
-      <w:lvlJc w:val="left"/>
-      <w:pPr>
-        <w:tabs>
-          <w:tab w:val="num" w:pos="0"/>
-        </w:tabs>
-        <w:ind w:left="0" w:hanging="0"/>
-      </w:pPr>
-      <w:rPr/>
+      <w:numFmt w:val="bullet"/>
+      <w:lvlText w:val=""/>
+      <w:lvlJc w:val="left"/>
+      <w:pPr>
+        <w:tabs>
+          <w:tab w:val="num" w:pos="1800"/>
+        </w:tabs>
+        <w:ind w:left="1800" w:hanging="360"/>
+      </w:pPr>
+      <w:rPr>
+        <w:rFonts w:ascii="Symbol" w:hAnsi="Symbol" w:cs="Symbol" w:hint="default"/>
+      </w:rPr>
     </w:lvl>
     <w:lvl w:ilvl="4">
       <w:start w:val="1"/>
-      <w:numFmt w:val="none"/>
-      <w:suff w:val="nothing"/>
-      <w:lvlText w:val="%5"/>
-      <w:lvlJc w:val="left"/>
-      <w:pPr>
-        <w:tabs>
-          <w:tab w:val="num" w:pos="0"/>
-        </w:tabs>
-        <w:ind w:left="0" w:hanging="0"/>
-      </w:pPr>
-      <w:rPr/>
+      <w:numFmt w:val="bullet"/>
+      <w:lvlText w:val="◦"/>
+      <w:lvlJc w:val="left"/>
+      <w:pPr>
+        <w:tabs>
+          <w:tab w:val="num" w:pos="2160"/>
+        </w:tabs>
+        <w:ind w:left="2160" w:hanging="360"/>
+      </w:pPr>
+      <w:rPr>
+        <w:rFonts w:ascii="OpenSymbol" w:hAnsi="OpenSymbol" w:cs="OpenSymbol" w:hint="default"/>
+      </w:rPr>
     </w:lvl>
     <w:lvl w:ilvl="5">
       <w:start w:val="1"/>
-      <w:numFmt w:val="none"/>
-      <w:suff w:val="nothing"/>
-      <w:lvlText w:val="%6"/>
-      <w:lvlJc w:val="left"/>
-      <w:pPr>
-        <w:tabs>
-          <w:tab w:val="num" w:pos="0"/>
-        </w:tabs>
-        <w:ind w:left="0" w:hanging="0"/>
-      </w:pPr>
-      <w:rPr/>
+      <w:numFmt w:val="bullet"/>
+      <w:lvlText w:val="▪"/>
+      <w:lvlJc w:val="left"/>
+      <w:pPr>
+        <w:tabs>
+          <w:tab w:val="num" w:pos="2520"/>
+        </w:tabs>
+        <w:ind w:left="2520" w:hanging="360"/>
+      </w:pPr>
+      <w:rPr>
+        <w:rFonts w:ascii="OpenSymbol" w:hAnsi="OpenSymbol" w:cs="OpenSymbol" w:hint="default"/>
+      </w:rPr>
     </w:lvl>
     <w:lvl w:ilvl="6">
       <w:start w:val="1"/>
-      <w:numFmt w:val="none"/>
-      <w:suff w:val="nothing"/>
-      <w:lvlText w:val="%7"/>
-      <w:lvlJc w:val="left"/>
-      <w:pPr>
-        <w:tabs>
-          <w:tab w:val="num" w:pos="0"/>
-        </w:tabs>
-        <w:ind w:left="0" w:hanging="0"/>
-      </w:pPr>
-      <w:rPr/>
+      <w:numFmt w:val="bullet"/>
+      <w:lvlText w:val=""/>
+      <w:lvlJc w:val="left"/>
+      <w:pPr>
+        <w:tabs>
+          <w:tab w:val="num" w:pos="2880"/>
+        </w:tabs>
+        <w:ind w:left="2880" w:hanging="360"/>
+      </w:pPr>
+      <w:rPr>
+        <w:rFonts w:ascii="Symbol" w:hAnsi="Symbol" w:cs="Symbol" w:hint="default"/>
+      </w:rPr>
     </w:lvl>
     <w:lvl w:ilvl="7">
       <w:start w:val="1"/>
-      <w:numFmt w:val="none"/>
-      <w:suff w:val="nothing"/>
-      <w:lvlText w:val="%8"/>
-      <w:lvlJc w:val="left"/>
-      <w:pPr>
-        <w:tabs>
-          <w:tab w:val="num" w:pos="0"/>
-        </w:tabs>
-        <w:ind w:left="0" w:hanging="0"/>
-      </w:pPr>
-      <w:rPr/>
+      <w:numFmt w:val="bullet"/>
+      <w:lvlText w:val="◦"/>
+      <w:lvlJc w:val="left"/>
+      <w:pPr>
+        <w:tabs>
+          <w:tab w:val="num" w:pos="3240"/>
+        </w:tabs>
+        <w:ind w:left="3240" w:hanging="360"/>
+      </w:pPr>
+      <w:rPr>
+        <w:rFonts w:ascii="OpenSymbol" w:hAnsi="OpenSymbol" w:cs="OpenSymbol" w:hint="default"/>
+      </w:rPr>
     </w:lvl>
     <w:lvl w:ilvl="8">
       <w:start w:val="1"/>
-      <w:numFmt w:val="none"/>
-      <w:suff w:val="nothing"/>
-      <w:lvlText w:val="%9"/>
-      <w:lvlJc w:val="left"/>
-      <w:pPr>
-        <w:tabs>
-          <w:tab w:val="num" w:pos="0"/>
-        </w:tabs>
-        <w:ind w:left="0" w:hanging="0"/>
-      </w:pPr>
-      <w:rPr/>
+      <w:numFmt w:val="bullet"/>
+      <w:lvlText w:val="▪"/>
+      <w:lvlJc w:val="left"/>
+      <w:pPr>
+        <w:tabs>
+          <w:tab w:val="num" w:pos="3600"/>
+        </w:tabs>
+        <w:ind w:left="3600" w:hanging="360"/>
+      </w:pPr>
+      <w:rPr>
+        <w:rFonts w:ascii="OpenSymbol" w:hAnsi="OpenSymbol" w:cs="OpenSymbol" w:hint="default"/>
+      </w:rPr>
     </w:lvl>
   </w:abstractNum>
   <w:abstractNum w:abstractNumId="3">
     <w:lvl w:ilvl="0">
       <w:start w:val="1"/>
-      <w:numFmt w:val="bullet"/>
-      <w:lvlText w:val=""/>
+      <w:numFmt w:val="decimal"/>
+      <w:lvlText w:val="%1."/>
       <w:lvlJc w:val="left"/>
       <w:pPr>
         <w:tabs>
@@ -2734,14 +3906,12 @@
         </w:tabs>
         <w:ind w:left="720" w:hanging="360"/>
       </w:pPr>
-      <w:rPr>
-        <w:rFonts w:ascii="Symbol" w:hAnsi="Symbol" w:cs="Symbol" w:hint="default"/>
-      </w:rPr>
+      <w:rPr/>
     </w:lvl>
     <w:lvl w:ilvl="1">
       <w:start w:val="1"/>
-      <w:numFmt w:val="bullet"/>
-      <w:lvlText w:val="◦"/>
+      <w:numFmt w:val="decimal"/>
+      <w:lvlText w:val="%2."/>
       <w:lvlJc w:val="left"/>
       <w:pPr>
         <w:tabs>
@@ -2749,14 +3919,12 @@
         </w:tabs>
         <w:ind w:left="1080" w:hanging="360"/>
       </w:pPr>
-      <w:rPr>
-        <w:rFonts w:ascii="OpenSymbol" w:hAnsi="OpenSymbol" w:cs="OpenSymbol" w:hint="default"/>
-      </w:rPr>
+      <w:rPr/>
     </w:lvl>
     <w:lvl w:ilvl="2">
       <w:start w:val="1"/>
-      <w:numFmt w:val="bullet"/>
-      <w:lvlText w:val="▪"/>
+      <w:numFmt w:val="decimal"/>
+      <w:lvlText w:val="%3."/>
       <w:lvlJc w:val="left"/>
       <w:pPr>
         <w:tabs>
@@ -2764,14 +3932,12 @@
         </w:tabs>
         <w:ind w:left="1440" w:hanging="360"/>
       </w:pPr>
-      <w:rPr>
-        <w:rFonts w:ascii="OpenSymbol" w:hAnsi="OpenSymbol" w:cs="OpenSymbol" w:hint="default"/>
-      </w:rPr>
+      <w:rPr/>
     </w:lvl>
     <w:lvl w:ilvl="3">
       <w:start w:val="1"/>
-      <w:numFmt w:val="bullet"/>
-      <w:lvlText w:val=""/>
+      <w:numFmt w:val="decimal"/>
+      <w:lvlText w:val="%4."/>
       <w:lvlJc w:val="left"/>
       <w:pPr>
         <w:tabs>
@@ -2779,14 +3945,12 @@
         </w:tabs>
         <w:ind w:left="1800" w:hanging="360"/>
       </w:pPr>
-      <w:rPr>
-        <w:rFonts w:ascii="Symbol" w:hAnsi="Symbol" w:cs="Symbol" w:hint="default"/>
-      </w:rPr>
+      <w:rPr/>
     </w:lvl>
     <w:lvl w:ilvl="4">
       <w:start w:val="1"/>
-      <w:numFmt w:val="bullet"/>
-      <w:lvlText w:val="◦"/>
+      <w:numFmt w:val="decimal"/>
+      <w:lvlText w:val="%5."/>
       <w:lvlJc w:val="left"/>
       <w:pPr>
         <w:tabs>
@@ -2794,14 +3958,12 @@
         </w:tabs>
         <w:ind w:left="2160" w:hanging="360"/>
       </w:pPr>
-      <w:rPr>
-        <w:rFonts w:ascii="OpenSymbol" w:hAnsi="OpenSymbol" w:cs="OpenSymbol" w:hint="default"/>
-      </w:rPr>
+      <w:rPr/>
     </w:lvl>
     <w:lvl w:ilvl="5">
       <w:start w:val="1"/>
-      <w:numFmt w:val="bullet"/>
-      <w:lvlText w:val="▪"/>
+      <w:numFmt w:val="decimal"/>
+      <w:lvlText w:val="%6."/>
       <w:lvlJc w:val="left"/>
       <w:pPr>
         <w:tabs>
@@ -2809,14 +3971,12 @@
         </w:tabs>
         <w:ind w:left="2520" w:hanging="360"/>
       </w:pPr>
-      <w:rPr>
-        <w:rFonts w:ascii="OpenSymbol" w:hAnsi="OpenSymbol" w:cs="OpenSymbol" w:hint="default"/>
-      </w:rPr>
+      <w:rPr/>
     </w:lvl>
     <w:lvl w:ilvl="6">
       <w:start w:val="1"/>
-      <w:numFmt w:val="bullet"/>
-      <w:lvlText w:val=""/>
+      <w:numFmt w:val="decimal"/>
+      <w:lvlText w:val="%7."/>
       <w:lvlJc w:val="left"/>
       <w:pPr>
         <w:tabs>
@@ -2824,14 +3984,12 @@
         </w:tabs>
         <w:ind w:left="2880" w:hanging="360"/>
       </w:pPr>
-      <w:rPr>
-        <w:rFonts w:ascii="Symbol" w:hAnsi="Symbol" w:cs="Symbol" w:hint="default"/>
-      </w:rPr>
+      <w:rPr/>
     </w:lvl>
     <w:lvl w:ilvl="7">
       <w:start w:val="1"/>
-      <w:numFmt w:val="bullet"/>
-      <w:lvlText w:val="◦"/>
+      <w:numFmt w:val="decimal"/>
+      <w:lvlText w:val="%8."/>
       <w:lvlJc w:val="left"/>
       <w:pPr>
         <w:tabs>
@@ -2839,14 +3997,12 @@
         </w:tabs>
         <w:ind w:left="3240" w:hanging="360"/>
       </w:pPr>
-      <w:rPr>
-        <w:rFonts w:ascii="OpenSymbol" w:hAnsi="OpenSymbol" w:cs="OpenSymbol" w:hint="default"/>
-      </w:rPr>
+      <w:rPr/>
     </w:lvl>
     <w:lvl w:ilvl="8">
       <w:start w:val="1"/>
-      <w:numFmt w:val="bullet"/>
-      <w:lvlText w:val="▪"/>
+      <w:numFmt w:val="decimal"/>
+      <w:lvlText w:val="%9."/>
       <w:lvlJc w:val="left"/>
       <w:pPr>
         <w:tabs>
@@ -2854,9 +4010,7 @@
         </w:tabs>
         <w:ind w:left="3600" w:hanging="360"/>
       </w:pPr>
-      <w:rPr>
-        <w:rFonts w:ascii="OpenSymbol" w:hAnsi="OpenSymbol" w:cs="OpenSymbol" w:hint="default"/>
-      </w:rPr>
+      <w:rPr/>
     </w:lvl>
   </w:abstractNum>
   <w:abstractNum w:abstractNumId="4">
@@ -2982,13 +4136,14 @@
     <w:lvl w:ilvl="0">
       <w:start w:val="1"/>
       <w:numFmt w:val="decimal"/>
-      <w:lvlText w:val="%1."/>
-      <w:lvlJc w:val="left"/>
-      <w:pPr>
-        <w:tabs>
-          <w:tab w:val="num" w:pos="720"/>
-        </w:tabs>
-        <w:ind w:left="720" w:hanging="360"/>
+      <w:suff w:val="space"/>
+      <w:lvlText w:val="3.α.%1."/>
+      <w:lvlJc w:val="left"/>
+      <w:pPr>
+        <w:tabs>
+          <w:tab w:val="num" w:pos="0"/>
+        </w:tabs>
+        <w:ind w:left="964" w:hanging="604"/>
       </w:pPr>
       <w:rPr/>
     </w:lvl>
@@ -3102,13 +4257,13 @@
       <w:start w:val="1"/>
       <w:numFmt w:val="decimal"/>
       <w:suff w:val="space"/>
-      <w:lvlText w:val="2.α.%1."/>
+      <w:lvlText w:val="5.α.%1."/>
       <w:lvlJc w:val="left"/>
       <w:pPr>
         <w:tabs>
           <w:tab w:val="num" w:pos="0"/>
         </w:tabs>
-        <w:ind w:left="964" w:hanging="604"/>
+        <w:ind w:left="975" w:hanging="615"/>
       </w:pPr>
       <w:rPr/>
     </w:lvl>
@@ -3222,13 +4377,13 @@
       <w:start w:val="1"/>
       <w:numFmt w:val="decimal"/>
       <w:suff w:val="space"/>
-      <w:lvlText w:val="5.α.%1."/>
+      <w:lvlText w:val="2.α.%1."/>
       <w:lvlJc w:val="left"/>
       <w:pPr>
         <w:tabs>
           <w:tab w:val="num" w:pos="0"/>
         </w:tabs>
-        <w:ind w:left="975" w:hanging="615"/>
+        <w:ind w:left="964" w:hanging="604"/>
       </w:pPr>
       <w:rPr/>
     </w:lvl>
@@ -3335,6 +4490,1083 @@
         <w:ind w:left="3600" w:hanging="360"/>
       </w:pPr>
       <w:rPr/>
+    </w:lvl>
+  </w:abstractNum>
+  <w:abstractNum w:abstractNumId="8">
+    <w:lvl w:ilvl="0">
+      <w:start w:val="1"/>
+      <w:numFmt w:val="decimal"/>
+      <w:lvlText w:val="%1."/>
+      <w:lvlJc w:val="left"/>
+      <w:pPr>
+        <w:tabs>
+          <w:tab w:val="num" w:pos="720"/>
+        </w:tabs>
+        <w:ind w:left="720" w:hanging="360"/>
+      </w:pPr>
+      <w:rPr/>
+    </w:lvl>
+    <w:lvl w:ilvl="1">
+      <w:start w:val="1"/>
+      <w:numFmt w:val="decimal"/>
+      <w:lvlText w:val="%2."/>
+      <w:lvlJc w:val="left"/>
+      <w:pPr>
+        <w:tabs>
+          <w:tab w:val="num" w:pos="1080"/>
+        </w:tabs>
+        <w:ind w:left="1080" w:hanging="360"/>
+      </w:pPr>
+      <w:rPr/>
+    </w:lvl>
+    <w:lvl w:ilvl="2">
+      <w:start w:val="1"/>
+      <w:numFmt w:val="decimal"/>
+      <w:lvlText w:val="%3."/>
+      <w:lvlJc w:val="left"/>
+      <w:pPr>
+        <w:tabs>
+          <w:tab w:val="num" w:pos="1440"/>
+        </w:tabs>
+        <w:ind w:left="1440" w:hanging="360"/>
+      </w:pPr>
+      <w:rPr/>
+    </w:lvl>
+    <w:lvl w:ilvl="3">
+      <w:start w:val="1"/>
+      <w:numFmt w:val="decimal"/>
+      <w:lvlText w:val="%4."/>
+      <w:lvlJc w:val="left"/>
+      <w:pPr>
+        <w:tabs>
+          <w:tab w:val="num" w:pos="1800"/>
+        </w:tabs>
+        <w:ind w:left="1800" w:hanging="360"/>
+      </w:pPr>
+      <w:rPr/>
+    </w:lvl>
+    <w:lvl w:ilvl="4">
+      <w:start w:val="1"/>
+      <w:numFmt w:val="decimal"/>
+      <w:lvlText w:val="%5."/>
+      <w:lvlJc w:val="left"/>
+      <w:pPr>
+        <w:tabs>
+          <w:tab w:val="num" w:pos="2160"/>
+        </w:tabs>
+        <w:ind w:left="2160" w:hanging="360"/>
+      </w:pPr>
+      <w:rPr/>
+    </w:lvl>
+    <w:lvl w:ilvl="5">
+      <w:start w:val="1"/>
+      <w:numFmt w:val="decimal"/>
+      <w:lvlText w:val="%6."/>
+      <w:lvlJc w:val="left"/>
+      <w:pPr>
+        <w:tabs>
+          <w:tab w:val="num" w:pos="2520"/>
+        </w:tabs>
+        <w:ind w:left="2520" w:hanging="360"/>
+      </w:pPr>
+      <w:rPr/>
+    </w:lvl>
+    <w:lvl w:ilvl="6">
+      <w:start w:val="1"/>
+      <w:numFmt w:val="decimal"/>
+      <w:lvlText w:val="%7."/>
+      <w:lvlJc w:val="left"/>
+      <w:pPr>
+        <w:tabs>
+          <w:tab w:val="num" w:pos="2880"/>
+        </w:tabs>
+        <w:ind w:left="2880" w:hanging="360"/>
+      </w:pPr>
+      <w:rPr/>
+    </w:lvl>
+    <w:lvl w:ilvl="7">
+      <w:start w:val="1"/>
+      <w:numFmt w:val="decimal"/>
+      <w:lvlText w:val="%8."/>
+      <w:lvlJc w:val="left"/>
+      <w:pPr>
+        <w:tabs>
+          <w:tab w:val="num" w:pos="3240"/>
+        </w:tabs>
+        <w:ind w:left="3240" w:hanging="360"/>
+      </w:pPr>
+      <w:rPr/>
+    </w:lvl>
+    <w:lvl w:ilvl="8">
+      <w:start w:val="1"/>
+      <w:numFmt w:val="decimal"/>
+      <w:lvlText w:val="%9."/>
+      <w:lvlJc w:val="left"/>
+      <w:pPr>
+        <w:tabs>
+          <w:tab w:val="num" w:pos="3600"/>
+        </w:tabs>
+        <w:ind w:left="3600" w:hanging="360"/>
+      </w:pPr>
+      <w:rPr/>
+    </w:lvl>
+  </w:abstractNum>
+  <w:abstractNum w:abstractNumId="9">
+    <w:lvl w:ilvl="0">
+      <w:start w:val="1"/>
+      <w:numFmt w:val="decimal"/>
+      <w:suff w:val="space"/>
+      <w:lvlText w:val="2.α.%1."/>
+      <w:lvlJc w:val="left"/>
+      <w:pPr>
+        <w:tabs>
+          <w:tab w:val="num" w:pos="0"/>
+        </w:tabs>
+        <w:ind w:left="964" w:hanging="604"/>
+      </w:pPr>
+      <w:rPr/>
+    </w:lvl>
+    <w:lvl w:ilvl="1">
+      <w:start w:val="1"/>
+      <w:numFmt w:val="decimal"/>
+      <w:lvlText w:val="%2."/>
+      <w:lvlJc w:val="left"/>
+      <w:pPr>
+        <w:tabs>
+          <w:tab w:val="num" w:pos="1080"/>
+        </w:tabs>
+        <w:ind w:left="1080" w:hanging="360"/>
+      </w:pPr>
+      <w:rPr/>
+    </w:lvl>
+    <w:lvl w:ilvl="2">
+      <w:start w:val="1"/>
+      <w:numFmt w:val="decimal"/>
+      <w:lvlText w:val="%3."/>
+      <w:lvlJc w:val="left"/>
+      <w:pPr>
+        <w:tabs>
+          <w:tab w:val="num" w:pos="1440"/>
+        </w:tabs>
+        <w:ind w:left="1440" w:hanging="360"/>
+      </w:pPr>
+      <w:rPr/>
+    </w:lvl>
+    <w:lvl w:ilvl="3">
+      <w:start w:val="1"/>
+      <w:numFmt w:val="decimal"/>
+      <w:lvlText w:val="%4."/>
+      <w:lvlJc w:val="left"/>
+      <w:pPr>
+        <w:tabs>
+          <w:tab w:val="num" w:pos="1800"/>
+        </w:tabs>
+        <w:ind w:left="1800" w:hanging="360"/>
+      </w:pPr>
+      <w:rPr/>
+    </w:lvl>
+    <w:lvl w:ilvl="4">
+      <w:start w:val="1"/>
+      <w:numFmt w:val="decimal"/>
+      <w:lvlText w:val="%5."/>
+      <w:lvlJc w:val="left"/>
+      <w:pPr>
+        <w:tabs>
+          <w:tab w:val="num" w:pos="2160"/>
+        </w:tabs>
+        <w:ind w:left="2160" w:hanging="360"/>
+      </w:pPr>
+      <w:rPr/>
+    </w:lvl>
+    <w:lvl w:ilvl="5">
+      <w:start w:val="1"/>
+      <w:numFmt w:val="decimal"/>
+      <w:lvlText w:val="%6."/>
+      <w:lvlJc w:val="left"/>
+      <w:pPr>
+        <w:tabs>
+          <w:tab w:val="num" w:pos="2520"/>
+        </w:tabs>
+        <w:ind w:left="2520" w:hanging="360"/>
+      </w:pPr>
+      <w:rPr/>
+    </w:lvl>
+    <w:lvl w:ilvl="6">
+      <w:start w:val="1"/>
+      <w:numFmt w:val="decimal"/>
+      <w:lvlText w:val="%7."/>
+      <w:lvlJc w:val="left"/>
+      <w:pPr>
+        <w:tabs>
+          <w:tab w:val="num" w:pos="2880"/>
+        </w:tabs>
+        <w:ind w:left="2880" w:hanging="360"/>
+      </w:pPr>
+      <w:rPr/>
+    </w:lvl>
+    <w:lvl w:ilvl="7">
+      <w:start w:val="1"/>
+      <w:numFmt w:val="decimal"/>
+      <w:lvlText w:val="%8."/>
+      <w:lvlJc w:val="left"/>
+      <w:pPr>
+        <w:tabs>
+          <w:tab w:val="num" w:pos="3240"/>
+        </w:tabs>
+        <w:ind w:left="3240" w:hanging="360"/>
+      </w:pPr>
+      <w:rPr/>
+    </w:lvl>
+    <w:lvl w:ilvl="8">
+      <w:start w:val="1"/>
+      <w:numFmt w:val="decimal"/>
+      <w:lvlText w:val="%9."/>
+      <w:lvlJc w:val="left"/>
+      <w:pPr>
+        <w:tabs>
+          <w:tab w:val="num" w:pos="3600"/>
+        </w:tabs>
+        <w:ind w:left="3600" w:hanging="360"/>
+      </w:pPr>
+      <w:rPr/>
+    </w:lvl>
+  </w:abstractNum>
+  <w:abstractNum w:abstractNumId="10">
+    <w:lvl w:ilvl="0">
+      <w:start w:val="1"/>
+      <w:numFmt w:val="decimal"/>
+      <w:suff w:val="space"/>
+      <w:lvlText w:val="4.β.%1."/>
+      <w:lvlJc w:val="left"/>
+      <w:pPr>
+        <w:tabs>
+          <w:tab w:val="num" w:pos="0"/>
+        </w:tabs>
+        <w:ind w:left="964" w:hanging="604"/>
+      </w:pPr>
+      <w:rPr/>
+    </w:lvl>
+    <w:lvl w:ilvl="1">
+      <w:start w:val="1"/>
+      <w:numFmt w:val="decimal"/>
+      <w:lvlText w:val="%2."/>
+      <w:lvlJc w:val="left"/>
+      <w:pPr>
+        <w:tabs>
+          <w:tab w:val="num" w:pos="1080"/>
+        </w:tabs>
+        <w:ind w:left="1080" w:hanging="360"/>
+      </w:pPr>
+      <w:rPr/>
+    </w:lvl>
+    <w:lvl w:ilvl="2">
+      <w:start w:val="1"/>
+      <w:numFmt w:val="decimal"/>
+      <w:lvlText w:val="%3."/>
+      <w:lvlJc w:val="left"/>
+      <w:pPr>
+        <w:tabs>
+          <w:tab w:val="num" w:pos="1440"/>
+        </w:tabs>
+        <w:ind w:left="1440" w:hanging="360"/>
+      </w:pPr>
+      <w:rPr/>
+    </w:lvl>
+    <w:lvl w:ilvl="3">
+      <w:start w:val="1"/>
+      <w:numFmt w:val="decimal"/>
+      <w:lvlText w:val="%4."/>
+      <w:lvlJc w:val="left"/>
+      <w:pPr>
+        <w:tabs>
+          <w:tab w:val="num" w:pos="1800"/>
+        </w:tabs>
+        <w:ind w:left="1800" w:hanging="360"/>
+      </w:pPr>
+      <w:rPr/>
+    </w:lvl>
+    <w:lvl w:ilvl="4">
+      <w:start w:val="1"/>
+      <w:numFmt w:val="decimal"/>
+      <w:lvlText w:val="%5."/>
+      <w:lvlJc w:val="left"/>
+      <w:pPr>
+        <w:tabs>
+          <w:tab w:val="num" w:pos="2160"/>
+        </w:tabs>
+        <w:ind w:left="2160" w:hanging="360"/>
+      </w:pPr>
+      <w:rPr/>
+    </w:lvl>
+    <w:lvl w:ilvl="5">
+      <w:start w:val="1"/>
+      <w:numFmt w:val="decimal"/>
+      <w:lvlText w:val="%6."/>
+      <w:lvlJc w:val="left"/>
+      <w:pPr>
+        <w:tabs>
+          <w:tab w:val="num" w:pos="2520"/>
+        </w:tabs>
+        <w:ind w:left="2520" w:hanging="360"/>
+      </w:pPr>
+      <w:rPr/>
+    </w:lvl>
+    <w:lvl w:ilvl="6">
+      <w:start w:val="1"/>
+      <w:numFmt w:val="decimal"/>
+      <w:lvlText w:val="%7."/>
+      <w:lvlJc w:val="left"/>
+      <w:pPr>
+        <w:tabs>
+          <w:tab w:val="num" w:pos="2880"/>
+        </w:tabs>
+        <w:ind w:left="2880" w:hanging="360"/>
+      </w:pPr>
+      <w:rPr/>
+    </w:lvl>
+    <w:lvl w:ilvl="7">
+      <w:start w:val="1"/>
+      <w:numFmt w:val="decimal"/>
+      <w:lvlText w:val="%8."/>
+      <w:lvlJc w:val="left"/>
+      <w:pPr>
+        <w:tabs>
+          <w:tab w:val="num" w:pos="3240"/>
+        </w:tabs>
+        <w:ind w:left="3240" w:hanging="360"/>
+      </w:pPr>
+      <w:rPr/>
+    </w:lvl>
+    <w:lvl w:ilvl="8">
+      <w:start w:val="1"/>
+      <w:numFmt w:val="decimal"/>
+      <w:lvlText w:val="%9."/>
+      <w:lvlJc w:val="left"/>
+      <w:pPr>
+        <w:tabs>
+          <w:tab w:val="num" w:pos="3600"/>
+        </w:tabs>
+        <w:ind w:left="3600" w:hanging="360"/>
+      </w:pPr>
+      <w:rPr/>
+    </w:lvl>
+  </w:abstractNum>
+  <w:abstractNum w:abstractNumId="11">
+    <w:lvl w:ilvl="0">
+      <w:start w:val="1"/>
+      <w:numFmt w:val="decimal"/>
+      <w:suff w:val="space"/>
+      <w:lvlText w:val="4.γ.%1."/>
+      <w:lvlJc w:val="left"/>
+      <w:pPr>
+        <w:tabs>
+          <w:tab w:val="num" w:pos="0"/>
+        </w:tabs>
+        <w:ind w:left="964" w:hanging="604"/>
+      </w:pPr>
+      <w:rPr/>
+    </w:lvl>
+    <w:lvl w:ilvl="1">
+      <w:start w:val="1"/>
+      <w:numFmt w:val="decimal"/>
+      <w:lvlText w:val="%2."/>
+      <w:lvlJc w:val="left"/>
+      <w:pPr>
+        <w:tabs>
+          <w:tab w:val="num" w:pos="1080"/>
+        </w:tabs>
+        <w:ind w:left="1080" w:hanging="360"/>
+      </w:pPr>
+      <w:rPr/>
+    </w:lvl>
+    <w:lvl w:ilvl="2">
+      <w:start w:val="1"/>
+      <w:numFmt w:val="decimal"/>
+      <w:lvlText w:val="%3."/>
+      <w:lvlJc w:val="left"/>
+      <w:pPr>
+        <w:tabs>
+          <w:tab w:val="num" w:pos="1440"/>
+        </w:tabs>
+        <w:ind w:left="1440" w:hanging="360"/>
+      </w:pPr>
+      <w:rPr/>
+    </w:lvl>
+    <w:lvl w:ilvl="3">
+      <w:start w:val="1"/>
+      <w:numFmt w:val="decimal"/>
+      <w:lvlText w:val="%4."/>
+      <w:lvlJc w:val="left"/>
+      <w:pPr>
+        <w:tabs>
+          <w:tab w:val="num" w:pos="1800"/>
+        </w:tabs>
+        <w:ind w:left="1800" w:hanging="360"/>
+      </w:pPr>
+      <w:rPr/>
+    </w:lvl>
+    <w:lvl w:ilvl="4">
+      <w:start w:val="1"/>
+      <w:numFmt w:val="decimal"/>
+      <w:lvlText w:val="%5."/>
+      <w:lvlJc w:val="left"/>
+      <w:pPr>
+        <w:tabs>
+          <w:tab w:val="num" w:pos="2160"/>
+        </w:tabs>
+        <w:ind w:left="2160" w:hanging="360"/>
+      </w:pPr>
+      <w:rPr/>
+    </w:lvl>
+    <w:lvl w:ilvl="5">
+      <w:start w:val="1"/>
+      <w:numFmt w:val="decimal"/>
+      <w:lvlText w:val="%6."/>
+      <w:lvlJc w:val="left"/>
+      <w:pPr>
+        <w:tabs>
+          <w:tab w:val="num" w:pos="2520"/>
+        </w:tabs>
+        <w:ind w:left="2520" w:hanging="360"/>
+      </w:pPr>
+      <w:rPr/>
+    </w:lvl>
+    <w:lvl w:ilvl="6">
+      <w:start w:val="1"/>
+      <w:numFmt w:val="decimal"/>
+      <w:lvlText w:val="%7."/>
+      <w:lvlJc w:val="left"/>
+      <w:pPr>
+        <w:tabs>
+          <w:tab w:val="num" w:pos="2880"/>
+        </w:tabs>
+        <w:ind w:left="2880" w:hanging="360"/>
+      </w:pPr>
+      <w:rPr/>
+    </w:lvl>
+    <w:lvl w:ilvl="7">
+      <w:start w:val="1"/>
+      <w:numFmt w:val="decimal"/>
+      <w:lvlText w:val="%8."/>
+      <w:lvlJc w:val="left"/>
+      <w:pPr>
+        <w:tabs>
+          <w:tab w:val="num" w:pos="3240"/>
+        </w:tabs>
+        <w:ind w:left="3240" w:hanging="360"/>
+      </w:pPr>
+      <w:rPr/>
+    </w:lvl>
+    <w:lvl w:ilvl="8">
+      <w:start w:val="1"/>
+      <w:numFmt w:val="decimal"/>
+      <w:lvlText w:val="%9."/>
+      <w:lvlJc w:val="left"/>
+      <w:pPr>
+        <w:tabs>
+          <w:tab w:val="num" w:pos="3600"/>
+        </w:tabs>
+        <w:ind w:left="3600" w:hanging="360"/>
+      </w:pPr>
+      <w:rPr/>
+    </w:lvl>
+  </w:abstractNum>
+  <w:abstractNum w:abstractNumId="12">
+    <w:lvl w:ilvl="0">
+      <w:start w:val="1"/>
+      <w:numFmt w:val="decimal"/>
+      <w:suff w:val="space"/>
+      <w:lvlText w:val="4.α.%1."/>
+      <w:lvlJc w:val="left"/>
+      <w:pPr>
+        <w:tabs>
+          <w:tab w:val="num" w:pos="0"/>
+        </w:tabs>
+        <w:ind w:left="964" w:hanging="604"/>
+      </w:pPr>
+      <w:rPr/>
+    </w:lvl>
+    <w:lvl w:ilvl="1">
+      <w:start w:val="1"/>
+      <w:numFmt w:val="decimal"/>
+      <w:lvlText w:val="%2."/>
+      <w:lvlJc w:val="left"/>
+      <w:pPr>
+        <w:tabs>
+          <w:tab w:val="num" w:pos="1080"/>
+        </w:tabs>
+        <w:ind w:left="1080" w:hanging="360"/>
+      </w:pPr>
+      <w:rPr/>
+    </w:lvl>
+    <w:lvl w:ilvl="2">
+      <w:start w:val="1"/>
+      <w:numFmt w:val="decimal"/>
+      <w:lvlText w:val="%3."/>
+      <w:lvlJc w:val="left"/>
+      <w:pPr>
+        <w:tabs>
+          <w:tab w:val="num" w:pos="1440"/>
+        </w:tabs>
+        <w:ind w:left="1440" w:hanging="360"/>
+      </w:pPr>
+      <w:rPr/>
+    </w:lvl>
+    <w:lvl w:ilvl="3">
+      <w:start w:val="1"/>
+      <w:numFmt w:val="decimal"/>
+      <w:lvlText w:val="%4."/>
+      <w:lvlJc w:val="left"/>
+      <w:pPr>
+        <w:tabs>
+          <w:tab w:val="num" w:pos="1800"/>
+        </w:tabs>
+        <w:ind w:left="1800" w:hanging="360"/>
+      </w:pPr>
+      <w:rPr/>
+    </w:lvl>
+    <w:lvl w:ilvl="4">
+      <w:start w:val="1"/>
+      <w:numFmt w:val="decimal"/>
+      <w:lvlText w:val="%5."/>
+      <w:lvlJc w:val="left"/>
+      <w:pPr>
+        <w:tabs>
+          <w:tab w:val="num" w:pos="2160"/>
+        </w:tabs>
+        <w:ind w:left="2160" w:hanging="360"/>
+      </w:pPr>
+      <w:rPr/>
+    </w:lvl>
+    <w:lvl w:ilvl="5">
+      <w:start w:val="1"/>
+      <w:numFmt w:val="decimal"/>
+      <w:lvlText w:val="%6."/>
+      <w:lvlJc w:val="left"/>
+      <w:pPr>
+        <w:tabs>
+          <w:tab w:val="num" w:pos="2520"/>
+        </w:tabs>
+        <w:ind w:left="2520" w:hanging="360"/>
+      </w:pPr>
+      <w:rPr/>
+    </w:lvl>
+    <w:lvl w:ilvl="6">
+      <w:start w:val="1"/>
+      <w:numFmt w:val="decimal"/>
+      <w:lvlText w:val="%7."/>
+      <w:lvlJc w:val="left"/>
+      <w:pPr>
+        <w:tabs>
+          <w:tab w:val="num" w:pos="2880"/>
+        </w:tabs>
+        <w:ind w:left="2880" w:hanging="360"/>
+      </w:pPr>
+      <w:rPr/>
+    </w:lvl>
+    <w:lvl w:ilvl="7">
+      <w:start w:val="1"/>
+      <w:numFmt w:val="decimal"/>
+      <w:lvlText w:val="%8."/>
+      <w:lvlJc w:val="left"/>
+      <w:pPr>
+        <w:tabs>
+          <w:tab w:val="num" w:pos="3240"/>
+        </w:tabs>
+        <w:ind w:left="3240" w:hanging="360"/>
+      </w:pPr>
+      <w:rPr/>
+    </w:lvl>
+    <w:lvl w:ilvl="8">
+      <w:start w:val="1"/>
+      <w:numFmt w:val="decimal"/>
+      <w:lvlText w:val="%9."/>
+      <w:lvlJc w:val="left"/>
+      <w:pPr>
+        <w:tabs>
+          <w:tab w:val="num" w:pos="3600"/>
+        </w:tabs>
+        <w:ind w:left="3600" w:hanging="360"/>
+      </w:pPr>
+      <w:rPr/>
+    </w:lvl>
+  </w:abstractNum>
+  <w:abstractNum w:abstractNumId="13">
+    <w:lvl w:ilvl="0">
+      <w:start w:val="1"/>
+      <w:numFmt w:val="decimal"/>
+      <w:lvlText w:val="%1."/>
+      <w:lvlJc w:val="left"/>
+      <w:pPr>
+        <w:tabs>
+          <w:tab w:val="num" w:pos="720"/>
+        </w:tabs>
+        <w:ind w:left="720" w:hanging="360"/>
+      </w:pPr>
+      <w:rPr/>
+    </w:lvl>
+    <w:lvl w:ilvl="1">
+      <w:start w:val="1"/>
+      <w:numFmt w:val="decimal"/>
+      <w:lvlText w:val="%2."/>
+      <w:lvlJc w:val="left"/>
+      <w:pPr>
+        <w:tabs>
+          <w:tab w:val="num" w:pos="1080"/>
+        </w:tabs>
+        <w:ind w:left="1080" w:hanging="360"/>
+      </w:pPr>
+      <w:rPr/>
+    </w:lvl>
+    <w:lvl w:ilvl="2">
+      <w:start w:val="1"/>
+      <w:numFmt w:val="decimal"/>
+      <w:lvlText w:val="%3."/>
+      <w:lvlJc w:val="left"/>
+      <w:pPr>
+        <w:tabs>
+          <w:tab w:val="num" w:pos="1440"/>
+        </w:tabs>
+        <w:ind w:left="1440" w:hanging="360"/>
+      </w:pPr>
+      <w:rPr/>
+    </w:lvl>
+    <w:lvl w:ilvl="3">
+      <w:start w:val="1"/>
+      <w:numFmt w:val="decimal"/>
+      <w:lvlText w:val="%4."/>
+      <w:lvlJc w:val="left"/>
+      <w:pPr>
+        <w:tabs>
+          <w:tab w:val="num" w:pos="1800"/>
+        </w:tabs>
+        <w:ind w:left="1800" w:hanging="360"/>
+      </w:pPr>
+      <w:rPr/>
+    </w:lvl>
+    <w:lvl w:ilvl="4">
+      <w:start w:val="1"/>
+      <w:numFmt w:val="decimal"/>
+      <w:lvlText w:val="%5."/>
+      <w:lvlJc w:val="left"/>
+      <w:pPr>
+        <w:tabs>
+          <w:tab w:val="num" w:pos="2160"/>
+        </w:tabs>
+        <w:ind w:left="2160" w:hanging="360"/>
+      </w:pPr>
+      <w:rPr/>
+    </w:lvl>
+    <w:lvl w:ilvl="5">
+      <w:start w:val="1"/>
+      <w:numFmt w:val="decimal"/>
+      <w:lvlText w:val="%6."/>
+      <w:lvlJc w:val="left"/>
+      <w:pPr>
+        <w:tabs>
+          <w:tab w:val="num" w:pos="2520"/>
+        </w:tabs>
+        <w:ind w:left="2520" w:hanging="360"/>
+      </w:pPr>
+      <w:rPr/>
+    </w:lvl>
+    <w:lvl w:ilvl="6">
+      <w:start w:val="1"/>
+      <w:numFmt w:val="decimal"/>
+      <w:lvlText w:val="%7."/>
+      <w:lvlJc w:val="left"/>
+      <w:pPr>
+        <w:tabs>
+          <w:tab w:val="num" w:pos="2880"/>
+        </w:tabs>
+        <w:ind w:left="2880" w:hanging="360"/>
+      </w:pPr>
+      <w:rPr/>
+    </w:lvl>
+    <w:lvl w:ilvl="7">
+      <w:start w:val="1"/>
+      <w:numFmt w:val="decimal"/>
+      <w:lvlText w:val="%8."/>
+      <w:lvlJc w:val="left"/>
+      <w:pPr>
+        <w:tabs>
+          <w:tab w:val="num" w:pos="3240"/>
+        </w:tabs>
+        <w:ind w:left="3240" w:hanging="360"/>
+      </w:pPr>
+      <w:rPr/>
+    </w:lvl>
+    <w:lvl w:ilvl="8">
+      <w:start w:val="1"/>
+      <w:numFmt w:val="decimal"/>
+      <w:lvlText w:val="%9."/>
+      <w:lvlJc w:val="left"/>
+      <w:pPr>
+        <w:tabs>
+          <w:tab w:val="num" w:pos="3600"/>
+        </w:tabs>
+        <w:ind w:left="3600" w:hanging="360"/>
+      </w:pPr>
+      <w:rPr/>
+    </w:lvl>
+  </w:abstractNum>
+  <w:abstractNum w:abstractNumId="14">
+    <w:lvl w:ilvl="0">
+      <w:start w:val="1"/>
+      <w:numFmt w:val="decimal"/>
+      <w:suff w:val="space"/>
+      <w:lvlText w:val="2.α.%1."/>
+      <w:lvlJc w:val="left"/>
+      <w:pPr>
+        <w:tabs>
+          <w:tab w:val="num" w:pos="0"/>
+        </w:tabs>
+        <w:ind w:left="964" w:hanging="604"/>
+      </w:pPr>
+      <w:rPr/>
+    </w:lvl>
+    <w:lvl w:ilvl="1">
+      <w:start w:val="1"/>
+      <w:numFmt w:val="decimal"/>
+      <w:lvlText w:val="%2."/>
+      <w:lvlJc w:val="left"/>
+      <w:pPr>
+        <w:tabs>
+          <w:tab w:val="num" w:pos="1080"/>
+        </w:tabs>
+        <w:ind w:left="1080" w:hanging="360"/>
+      </w:pPr>
+      <w:rPr/>
+    </w:lvl>
+    <w:lvl w:ilvl="2">
+      <w:start w:val="1"/>
+      <w:numFmt w:val="decimal"/>
+      <w:lvlText w:val="%3."/>
+      <w:lvlJc w:val="left"/>
+      <w:pPr>
+        <w:tabs>
+          <w:tab w:val="num" w:pos="1440"/>
+        </w:tabs>
+        <w:ind w:left="1440" w:hanging="360"/>
+      </w:pPr>
+      <w:rPr/>
+    </w:lvl>
+    <w:lvl w:ilvl="3">
+      <w:start w:val="1"/>
+      <w:numFmt w:val="decimal"/>
+      <w:lvlText w:val="%4."/>
+      <w:lvlJc w:val="left"/>
+      <w:pPr>
+        <w:tabs>
+          <w:tab w:val="num" w:pos="1800"/>
+        </w:tabs>
+        <w:ind w:left="1800" w:hanging="360"/>
+      </w:pPr>
+      <w:rPr/>
+    </w:lvl>
+    <w:lvl w:ilvl="4">
+      <w:start w:val="1"/>
+      <w:numFmt w:val="decimal"/>
+      <w:lvlText w:val="%5."/>
+      <w:lvlJc w:val="left"/>
+      <w:pPr>
+        <w:tabs>
+          <w:tab w:val="num" w:pos="2160"/>
+        </w:tabs>
+        <w:ind w:left="2160" w:hanging="360"/>
+      </w:pPr>
+      <w:rPr/>
+    </w:lvl>
+    <w:lvl w:ilvl="5">
+      <w:start w:val="1"/>
+      <w:numFmt w:val="decimal"/>
+      <w:lvlText w:val="%6."/>
+      <w:lvlJc w:val="left"/>
+      <w:pPr>
+        <w:tabs>
+          <w:tab w:val="num" w:pos="2520"/>
+        </w:tabs>
+        <w:ind w:left="2520" w:hanging="360"/>
+      </w:pPr>
+      <w:rPr/>
+    </w:lvl>
+    <w:lvl w:ilvl="6">
+      <w:start w:val="1"/>
+      <w:numFmt w:val="decimal"/>
+      <w:lvlText w:val="%7."/>
+      <w:lvlJc w:val="left"/>
+      <w:pPr>
+        <w:tabs>
+          <w:tab w:val="num" w:pos="2880"/>
+        </w:tabs>
+        <w:ind w:left="2880" w:hanging="360"/>
+      </w:pPr>
+      <w:rPr/>
+    </w:lvl>
+    <w:lvl w:ilvl="7">
+      <w:start w:val="1"/>
+      <w:numFmt w:val="decimal"/>
+      <w:lvlText w:val="%8."/>
+      <w:lvlJc w:val="left"/>
+      <w:pPr>
+        <w:tabs>
+          <w:tab w:val="num" w:pos="3240"/>
+        </w:tabs>
+        <w:ind w:left="3240" w:hanging="360"/>
+      </w:pPr>
+      <w:rPr/>
+    </w:lvl>
+    <w:lvl w:ilvl="8">
+      <w:start w:val="1"/>
+      <w:numFmt w:val="decimal"/>
+      <w:lvlText w:val="%9."/>
+      <w:lvlJc w:val="left"/>
+      <w:pPr>
+        <w:tabs>
+          <w:tab w:val="num" w:pos="3600"/>
+        </w:tabs>
+        <w:ind w:left="3600" w:hanging="360"/>
+      </w:pPr>
+      <w:rPr/>
+    </w:lvl>
+  </w:abstractNum>
+  <w:abstractNum w:abstractNumId="15">
+    <w:lvl w:ilvl="0">
+      <w:start w:val="1"/>
+      <w:numFmt w:val="decimal"/>
+      <w:suff w:val="space"/>
+      <w:lvlText w:val="4.α.%1."/>
+      <w:lvlJc w:val="left"/>
+      <w:pPr>
+        <w:tabs>
+          <w:tab w:val="num" w:pos="0"/>
+        </w:tabs>
+        <w:ind w:left="964" w:hanging="604"/>
+      </w:pPr>
+      <w:rPr/>
+    </w:lvl>
+    <w:lvl w:ilvl="1">
+      <w:start w:val="1"/>
+      <w:numFmt w:val="decimal"/>
+      <w:lvlText w:val="%2."/>
+      <w:lvlJc w:val="left"/>
+      <w:pPr>
+        <w:tabs>
+          <w:tab w:val="num" w:pos="1080"/>
+        </w:tabs>
+        <w:ind w:left="1080" w:hanging="360"/>
+      </w:pPr>
+      <w:rPr/>
+    </w:lvl>
+    <w:lvl w:ilvl="2">
+      <w:start w:val="1"/>
+      <w:numFmt w:val="decimal"/>
+      <w:lvlText w:val="%3."/>
+      <w:lvlJc w:val="left"/>
+      <w:pPr>
+        <w:tabs>
+          <w:tab w:val="num" w:pos="1440"/>
+        </w:tabs>
+        <w:ind w:left="1440" w:hanging="360"/>
+      </w:pPr>
+      <w:rPr/>
+    </w:lvl>
+    <w:lvl w:ilvl="3">
+      <w:start w:val="1"/>
+      <w:numFmt w:val="decimal"/>
+      <w:lvlText w:val="%4."/>
+      <w:lvlJc w:val="left"/>
+      <w:pPr>
+        <w:tabs>
+          <w:tab w:val="num" w:pos="1800"/>
+        </w:tabs>
+        <w:ind w:left="1800" w:hanging="360"/>
+      </w:pPr>
+      <w:rPr/>
+    </w:lvl>
+    <w:lvl w:ilvl="4">
+      <w:start w:val="1"/>
+      <w:numFmt w:val="decimal"/>
+      <w:lvlText w:val="%5."/>
+      <w:lvlJc w:val="left"/>
+      <w:pPr>
+        <w:tabs>
+          <w:tab w:val="num" w:pos="2160"/>
+        </w:tabs>
+        <w:ind w:left="2160" w:hanging="360"/>
+      </w:pPr>
+      <w:rPr/>
+    </w:lvl>
+    <w:lvl w:ilvl="5">
+      <w:start w:val="1"/>
+      <w:numFmt w:val="decimal"/>
+      <w:lvlText w:val="%6."/>
+      <w:lvlJc w:val="left"/>
+      <w:pPr>
+        <w:tabs>
+          <w:tab w:val="num" w:pos="2520"/>
+        </w:tabs>
+        <w:ind w:left="2520" w:hanging="360"/>
+      </w:pPr>
+      <w:rPr/>
+    </w:lvl>
+    <w:lvl w:ilvl="6">
+      <w:start w:val="1"/>
+      <w:numFmt w:val="decimal"/>
+      <w:lvlText w:val="%7."/>
+      <w:lvlJc w:val="left"/>
+      <w:pPr>
+        <w:tabs>
+          <w:tab w:val="num" w:pos="2880"/>
+        </w:tabs>
+        <w:ind w:left="2880" w:hanging="360"/>
+      </w:pPr>
+      <w:rPr/>
+    </w:lvl>
+    <w:lvl w:ilvl="7">
+      <w:start w:val="1"/>
+      <w:numFmt w:val="decimal"/>
+      <w:lvlText w:val="%8."/>
+      <w:lvlJc w:val="left"/>
+      <w:pPr>
+        <w:tabs>
+          <w:tab w:val="num" w:pos="3240"/>
+        </w:tabs>
+        <w:ind w:left="3240" w:hanging="360"/>
+      </w:pPr>
+      <w:rPr/>
+    </w:lvl>
+    <w:lvl w:ilvl="8">
+      <w:start w:val="1"/>
+      <w:numFmt w:val="decimal"/>
+      <w:lvlText w:val="%9."/>
+      <w:lvlJc w:val="left"/>
+      <w:pPr>
+        <w:tabs>
+          <w:tab w:val="num" w:pos="3600"/>
+        </w:tabs>
+        <w:ind w:left="3600" w:hanging="360"/>
+      </w:pPr>
+      <w:rPr/>
+    </w:lvl>
+  </w:abstractNum>
+  <w:abstractNum w:abstractNumId="16">
+    <w:lvl w:ilvl="0">
+      <w:start w:val="1"/>
+      <w:numFmt w:val="none"/>
+      <w:suff w:val="nothing"/>
+      <w:lvlText w:val=""/>
+      <w:lvlJc w:val="left"/>
+      <w:pPr>
+        <w:tabs>
+          <w:tab w:val="num" w:pos="0"/>
+        </w:tabs>
+        <w:ind w:left="0" w:hanging="0"/>
+      </w:pPr>
+    </w:lvl>
+    <w:lvl w:ilvl="1">
+      <w:start w:val="1"/>
+      <w:numFmt w:val="none"/>
+      <w:suff w:val="nothing"/>
+      <w:lvlText w:val=""/>
+      <w:lvlJc w:val="left"/>
+      <w:pPr>
+        <w:tabs>
+          <w:tab w:val="num" w:pos="0"/>
+        </w:tabs>
+        <w:ind w:left="0" w:hanging="0"/>
+      </w:pPr>
+    </w:lvl>
+    <w:lvl w:ilvl="2">
+      <w:start w:val="1"/>
+      <w:numFmt w:val="none"/>
+      <w:suff w:val="nothing"/>
+      <w:lvlText w:val=""/>
+      <w:lvlJc w:val="left"/>
+      <w:pPr>
+        <w:tabs>
+          <w:tab w:val="num" w:pos="0"/>
+        </w:tabs>
+        <w:ind w:left="0" w:hanging="0"/>
+      </w:pPr>
+    </w:lvl>
+    <w:lvl w:ilvl="3">
+      <w:start w:val="1"/>
+      <w:numFmt w:val="none"/>
+      <w:suff w:val="nothing"/>
+      <w:lvlText w:val=""/>
+      <w:lvlJc w:val="left"/>
+      <w:pPr>
+        <w:tabs>
+          <w:tab w:val="num" w:pos="0"/>
+        </w:tabs>
+        <w:ind w:left="0" w:hanging="0"/>
+      </w:pPr>
+    </w:lvl>
+    <w:lvl w:ilvl="4">
+      <w:start w:val="1"/>
+      <w:numFmt w:val="none"/>
+      <w:suff w:val="nothing"/>
+      <w:lvlText w:val=""/>
+      <w:lvlJc w:val="left"/>
+      <w:pPr>
+        <w:tabs>
+          <w:tab w:val="num" w:pos="0"/>
+        </w:tabs>
+        <w:ind w:left="0" w:hanging="0"/>
+      </w:pPr>
+    </w:lvl>
+    <w:lvl w:ilvl="5">
+      <w:start w:val="1"/>
+      <w:numFmt w:val="none"/>
+      <w:suff w:val="nothing"/>
+      <w:lvlText w:val=""/>
+      <w:lvlJc w:val="left"/>
+      <w:pPr>
+        <w:tabs>
+          <w:tab w:val="num" w:pos="0"/>
+        </w:tabs>
+        <w:ind w:left="0" w:hanging="0"/>
+      </w:pPr>
+    </w:lvl>
+    <w:lvl w:ilvl="6">
+      <w:start w:val="1"/>
+      <w:numFmt w:val="none"/>
+      <w:suff w:val="nothing"/>
+      <w:lvlText w:val=""/>
+      <w:lvlJc w:val="left"/>
+      <w:pPr>
+        <w:tabs>
+          <w:tab w:val="num" w:pos="0"/>
+        </w:tabs>
+        <w:ind w:left="0" w:hanging="0"/>
+      </w:pPr>
+    </w:lvl>
+    <w:lvl w:ilvl="7">
+      <w:start w:val="1"/>
+      <w:numFmt w:val="none"/>
+      <w:suff w:val="nothing"/>
+      <w:lvlText w:val=""/>
+      <w:lvlJc w:val="left"/>
+      <w:pPr>
+        <w:tabs>
+          <w:tab w:val="num" w:pos="0"/>
+        </w:tabs>
+        <w:ind w:left="0" w:hanging="0"/>
+      </w:pPr>
+    </w:lvl>
+    <w:lvl w:ilvl="8">
+      <w:start w:val="1"/>
+      <w:numFmt w:val="none"/>
+      <w:suff w:val="nothing"/>
+      <w:lvlText w:val=""/>
+      <w:lvlJc w:val="left"/>
+      <w:pPr>
+        <w:tabs>
+          <w:tab w:val="num" w:pos="0"/>
+        </w:tabs>
+        <w:ind w:left="0" w:hanging="0"/>
+      </w:pPr>
     </w:lvl>
   </w:abstractNum>
   <w:num w:numId="1">
@@ -3358,6 +5590,33 @@
   <w:num w:numId="7">
     <w:abstractNumId w:val="7"/>
   </w:num>
+  <w:num w:numId="8">
+    <w:abstractNumId w:val="8"/>
+  </w:num>
+  <w:num w:numId="9">
+    <w:abstractNumId w:val="9"/>
+  </w:num>
+  <w:num w:numId="10">
+    <w:abstractNumId w:val="10"/>
+  </w:num>
+  <w:num w:numId="11">
+    <w:abstractNumId w:val="11"/>
+  </w:num>
+  <w:num w:numId="12">
+    <w:abstractNumId w:val="12"/>
+  </w:num>
+  <w:num w:numId="13">
+    <w:abstractNumId w:val="13"/>
+  </w:num>
+  <w:num w:numId="14">
+    <w:abstractNumId w:val="14"/>
+  </w:num>
+  <w:num w:numId="15">
+    <w:abstractNumId w:val="15"/>
+  </w:num>
+  <w:num w:numId="16">
+    <w:abstractNumId w:val="16"/>
+  </w:num>
 </w:numbering>
 </file>
 
@@ -3385,9 +5644,7 @@
     <w:pPr>
       <w:widowControl/>
       <w:suppressAutoHyphens w:val="true"/>
-      <w:kinsoku w:val="true"/>
       <w:overflowPunct w:val="true"/>
-      <w:autoSpaceDE w:val="true"/>
       <w:bidi w:val="0"/>
       <w:spacing w:before="0" w:after="0"/>
       <w:jc w:val="left"/>
@@ -3409,7 +5666,7 @@
     <w:pPr>
       <w:numPr>
         <w:ilvl w:val="0"/>
-        <w:numId w:val="2"/>
+        <w:numId w:val="1"/>
       </w:numPr>
       <w:spacing w:before="240" w:after="120"/>
       <w:outlineLvl w:val="0"/>
@@ -3429,7 +5686,7 @@
     <w:pPr>
       <w:numPr>
         <w:ilvl w:val="1"/>
-        <w:numId w:val="2"/>
+        <w:numId w:val="1"/>
       </w:numPr>
       <w:spacing w:before="200" w:after="120"/>
       <w:outlineLvl w:val="1"/>
@@ -3449,7 +5706,7 @@
     <w:pPr>
       <w:numPr>
         <w:ilvl w:val="2"/>
-        <w:numId w:val="2"/>
+        <w:numId w:val="1"/>
       </w:numPr>
       <w:spacing w:before="140" w:after="120"/>
       <w:outlineLvl w:val="2"/>
@@ -3467,6 +5724,11 @@
     <w:rPr>
       <w:rFonts w:ascii="OpenSymbol" w:hAnsi="OpenSymbol" w:eastAsia="OpenSymbol" w:cs="OpenSymbol"/>
     </w:rPr>
+  </w:style>
+  <w:style w:type="character" w:styleId="NumberingSymbols">
+    <w:name w:val="Numbering Symbols"/>
+    <w:qFormat/>
+    <w:rPr/>
   </w:style>
   <w:style w:type="paragraph" w:styleId="Heading">
     <w:name w:val="Heading"/>
@@ -3547,6 +5809,19 @@
       <w:suppressLineNumbers/>
     </w:pPr>
     <w:rPr/>
+  </w:style>
+  <w:style w:type="paragraph" w:styleId="Comment">
+    <w:name w:val="Comment"/>
+    <w:basedOn w:val="Normal"/>
+    <w:qFormat/>
+    <w:pPr>
+      <w:spacing w:before="56" w:after="0"/>
+      <w:ind w:left="56" w:right="56"/>
+    </w:pPr>
+    <w:rPr>
+      <w:sz w:val="20"/>
+      <w:szCs w:val="20"/>
+    </w:rPr>
   </w:style>
 </w:styles>
 </file>

</xml_diff>